<commit_message>
feat: add contract templates and generation prompt documents
</commit_message>
<xml_diff>
--- a/documents/contract-template/HomeSpace_01_Hop_Dong_Thue_Nha_Nguyen_Can.docx
+++ b/documents/contract-template/HomeSpace_01_Hop_Dong_Thue_Nha_Nguyen_Can.docx
@@ -5,16 +5,17 @@
     <w:p>
       <w:pPr>
         <w:keepNext w:val="0"/>
-        <w:spacing w:before="0" w:after="40" w:line="276" w:lineRule="auto"/>
+        <w:widowControl/>
+        <w:spacing w:before="0" w:after="20" w:line="276" w:lineRule="auto"/>
+        <w:ind w:left="0" w:firstLine="0"/>
         <w:jc w:val="center"/>
-        <w:widowControl w:val="1"/>
       </w:pPr>
       <w:r>
         <w:rPr>
           <w:rFonts w:ascii="Times New Roman" w:hAnsi="Times New Roman" w:eastAsia="Times New Roman"/>
           <w:b/>
           <w:i w:val="0"/>
-          <w:sz w:val="26"/>
+          <w:sz w:val="25"/>
         </w:rPr>
         <w:t>CỘNG HÒA XÃ HỘI CHỦ NGHĨA VIỆT NAM</w:t>
       </w:r>
@@ -22,16 +23,17 @@
     <w:p>
       <w:pPr>
         <w:keepNext w:val="0"/>
+        <w:widowControl/>
         <w:spacing w:before="0" w:after="240" w:line="276" w:lineRule="auto"/>
+        <w:ind w:left="0" w:firstLine="0"/>
         <w:jc w:val="center"/>
-        <w:widowControl w:val="1"/>
       </w:pPr>
       <w:r>
         <w:rPr>
           <w:rFonts w:ascii="Times New Roman" w:hAnsi="Times New Roman" w:eastAsia="Times New Roman"/>
           <w:b/>
           <w:i w:val="0"/>
-          <w:sz w:val="26"/>
+          <w:sz w:val="25"/>
         </w:rPr>
         <w:t>Độc lập - Tự do - Hạnh phúc</w:t>
       </w:r>
@@ -39,9 +41,10 @@
     <w:p>
       <w:pPr>
         <w:keepNext w:val="0"/>
-        <w:spacing w:before="0" w:after="120" w:line="276" w:lineRule="auto"/>
+        <w:widowControl/>
+        <w:spacing w:before="0" w:after="60" w:line="276" w:lineRule="auto"/>
+        <w:ind w:left="0" w:firstLine="0"/>
         <w:jc w:val="center"/>
-        <w:widowControl w:val="1"/>
       </w:pPr>
       <w:r>
         <w:rPr>
@@ -56,80 +59,28 @@
     <w:p>
       <w:pPr>
         <w:keepNext w:val="0"/>
+        <w:widowControl/>
         <w:spacing w:before="0" w:after="160" w:line="276" w:lineRule="auto"/>
+        <w:ind w:left="0" w:firstLine="0"/>
         <w:jc w:val="center"/>
-        <w:widowControl w:val="1"/>
       </w:pPr>
       <w:r>
         <w:rPr>
           <w:rFonts w:ascii="Times New Roman" w:hAnsi="Times New Roman" w:eastAsia="Times New Roman"/>
           <w:b w:val="0"/>
           <w:i w:val="0"/>
-          <w:sz w:val="22"/>
+          <w:sz w:val="23"/>
         </w:rPr>
-        <w:t xml:space="preserve">Số: </w:t>
-      </w:r>
-      <w:r>
-        <w:rPr>
-          <w:rFonts w:ascii="Times New Roman" w:hAnsi="Times New Roman" w:eastAsia="Times New Roman"/>
-          <w:b/>
-          <w:i w:val="0"/>
-          <w:sz w:val="22"/>
-        </w:rPr>
-        <w:t>{{contract.number}}</w:t>
-      </w:r>
-      <w:r>
-        <w:rPr>
-          <w:rFonts w:ascii="Times New Roman" w:hAnsi="Times New Roman" w:eastAsia="Times New Roman"/>
-          <w:b w:val="0"/>
-          <w:i w:val="0"/>
-          <w:sz w:val="22"/>
-        </w:rPr>
-        <w:t xml:space="preserve"> - Ngày ký: </w:t>
-      </w:r>
-      <w:r>
-        <w:rPr>
-          <w:rFonts w:ascii="Times New Roman" w:hAnsi="Times New Roman" w:eastAsia="Times New Roman"/>
-          <w:b w:val="0"/>
-          <w:i w:val="0"/>
-          <w:sz w:val="22"/>
-        </w:rPr>
-        <w:t>{{contract.signingDate}}</w:t>
-      </w:r>
-      <w:r>
-        <w:rPr>
-          <w:rFonts w:ascii="Times New Roman" w:hAnsi="Times New Roman" w:eastAsia="Times New Roman"/>
-          <w:b w:val="0"/>
-          <w:i w:val="0"/>
-          <w:sz w:val="22"/>
-        </w:rPr>
-        <w:t xml:space="preserve"> tại </w:t>
-      </w:r>
-      <w:r>
-        <w:rPr>
-          <w:rFonts w:ascii="Times New Roman" w:hAnsi="Times New Roman" w:eastAsia="Times New Roman"/>
-          <w:b w:val="0"/>
-          <w:i w:val="0"/>
-          <w:sz w:val="22"/>
-        </w:rPr>
-        <w:t>{{contract.signingCity}}</w:t>
-      </w:r>
-      <w:r>
-        <w:rPr>
-          <w:rFonts w:ascii="Times New Roman" w:hAnsi="Times New Roman" w:eastAsia="Times New Roman"/>
-          <w:b w:val="0"/>
-          <w:i w:val="0"/>
-          <w:sz w:val="22"/>
-        </w:rPr>
-        <w:t>.</w:t>
+        <w:t>Số: {{contract.number}} - Ngày ký: {{contract.signingDate}} tại {{contract.signingCity}}.</w:t>
       </w:r>
     </w:p>
     <w:p>
       <w:pPr>
         <w:keepNext/>
+        <w:widowControl/>
         <w:spacing w:before="160" w:after="80" w:line="276" w:lineRule="auto"/>
-        <w:jc w:val="both"/>
-        <w:widowControl w:val="1"/>
+        <w:ind w:left="0" w:firstLine="0"/>
+        <w:jc w:val="left"/>
       </w:pPr>
       <w:r>
         <w:rPr>
@@ -144,10 +95,10 @@
     <w:p>
       <w:pPr>
         <w:keepNext w:val="0"/>
-        <w:spacing w:before="0" w:after="80" w:line="276" w:lineRule="auto"/>
-        <w:ind w:left="255" w:hanging="142"/>
+        <w:widowControl/>
+        <w:spacing w:before="0" w:after="60" w:line="276" w:lineRule="auto"/>
+        <w:ind w:left="227" w:hanging="170"/>
         <w:jc w:val="both"/>
-        <w:widowControl w:val="1"/>
       </w:pPr>
       <w:r>
         <w:rPr>
@@ -162,10 +113,10 @@
     <w:p>
       <w:pPr>
         <w:keepNext w:val="0"/>
-        <w:spacing w:before="0" w:after="80" w:line="276" w:lineRule="auto"/>
-        <w:ind w:left="255" w:hanging="142"/>
+        <w:widowControl/>
+        <w:spacing w:before="0" w:after="60" w:line="276" w:lineRule="auto"/>
+        <w:ind w:left="227" w:hanging="170"/>
         <w:jc w:val="both"/>
-        <w:widowControl w:val="1"/>
       </w:pPr>
       <w:r>
         <w:rPr>
@@ -180,10 +131,10 @@
     <w:p>
       <w:pPr>
         <w:keepNext w:val="0"/>
-        <w:spacing w:before="0" w:after="80" w:line="276" w:lineRule="auto"/>
-        <w:ind w:left="255" w:hanging="142"/>
+        <w:widowControl/>
+        <w:spacing w:before="0" w:after="60" w:line="276" w:lineRule="auto"/>
+        <w:ind w:left="227" w:hanging="170"/>
         <w:jc w:val="both"/>
-        <w:widowControl w:val="1"/>
       </w:pPr>
       <w:r>
         <w:rPr>
@@ -198,10 +149,10 @@
     <w:p>
       <w:pPr>
         <w:keepNext w:val="0"/>
-        <w:spacing w:before="0" w:after="80" w:line="276" w:lineRule="auto"/>
-        <w:ind w:left="255" w:hanging="142"/>
+        <w:widowControl/>
+        <w:spacing w:before="0" w:after="60" w:line="276" w:lineRule="auto"/>
+        <w:ind w:left="227" w:hanging="170"/>
         <w:jc w:val="both"/>
-        <w:widowControl w:val="1"/>
       </w:pPr>
       <w:r>
         <w:rPr>
@@ -216,10 +167,10 @@
     <w:p>
       <w:pPr>
         <w:keepNext w:val="0"/>
-        <w:spacing w:before="0" w:after="80" w:line="276" w:lineRule="auto"/>
-        <w:ind w:left="255" w:hanging="142"/>
+        <w:widowControl/>
+        <w:spacing w:before="0" w:after="60" w:line="276" w:lineRule="auto"/>
+        <w:ind w:left="227" w:hanging="170"/>
         <w:jc w:val="both"/>
-        <w:widowControl w:val="1"/>
       </w:pPr>
       <w:r>
         <w:rPr>
@@ -234,10 +185,10 @@
     <w:p>
       <w:pPr>
         <w:keepNext w:val="0"/>
-        <w:spacing w:before="0" w:after="80" w:line="276" w:lineRule="auto"/>
-        <w:ind w:left="255" w:hanging="142"/>
+        <w:widowControl/>
+        <w:spacing w:before="0" w:after="60" w:line="276" w:lineRule="auto"/>
+        <w:ind w:left="227" w:hanging="170"/>
         <w:jc w:val="both"/>
-        <w:widowControl w:val="1"/>
       </w:pPr>
       <w:r>
         <w:rPr>
@@ -252,9 +203,10 @@
     <w:p>
       <w:pPr>
         <w:keepNext/>
+        <w:widowControl/>
         <w:spacing w:before="160" w:after="80" w:line="276" w:lineRule="auto"/>
-        <w:jc w:val="both"/>
-        <w:widowControl w:val="1"/>
+        <w:ind w:left="0" w:firstLine="0"/>
+        <w:jc w:val="left"/>
       </w:pPr>
       <w:r>
         <w:rPr>
@@ -269,9 +221,10 @@
     <w:p>
       <w:pPr>
         <w:keepNext w:val="0"/>
-        <w:spacing w:before="0" w:after="80" w:line="276" w:lineRule="auto"/>
-        <w:jc w:val="both"/>
-        <w:widowControl w:val="1"/>
+        <w:widowControl/>
+        <w:spacing w:before="0" w:after="40" w:line="276" w:lineRule="auto"/>
+        <w:ind w:left="0" w:firstLine="0"/>
+        <w:jc w:val="left"/>
       </w:pPr>
       <w:r>
         <w:rPr>
@@ -285,7 +238,7 @@
       <w:r>
         <w:rPr>
           <w:rFonts w:ascii="Times New Roman" w:hAnsi="Times New Roman" w:eastAsia="Times New Roman"/>
-          <w:b/>
+          <w:b w:val="0"/>
           <w:i w:val="0"/>
           <w:sz w:val="24"/>
         </w:rPr>
@@ -295,9 +248,10 @@
     <w:p>
       <w:pPr>
         <w:keepNext w:val="0"/>
+        <w:widowControl/>
         <w:spacing w:before="0" w:after="80" w:line="276" w:lineRule="auto"/>
-        <w:jc w:val="both"/>
-        <w:widowControl w:val="1"/>
+        <w:ind w:left="0" w:firstLine="0"/>
+        <w:jc w:val="left"/>
       </w:pPr>
       <w:r>
         <w:rPr>
@@ -306,51 +260,16 @@
           <w:i w:val="0"/>
           <w:sz w:val="24"/>
         </w:rPr>
-        <w:t xml:space="preserve">CCCD/Hộ chiếu: </w:t>
-      </w:r>
-      <w:r>
-        <w:rPr>
-          <w:rFonts w:ascii="Times New Roman" w:hAnsi="Times New Roman" w:eastAsia="Times New Roman"/>
-          <w:b w:val="0"/>
-          <w:i w:val="0"/>
-          <w:sz w:val="24"/>
-        </w:rPr>
-        <w:t>{{landlord.idNumber}}</w:t>
-      </w:r>
-      <w:r>
-        <w:rPr>
-          <w:rFonts w:ascii="Times New Roman" w:hAnsi="Times New Roman" w:eastAsia="Times New Roman"/>
-          <w:b w:val="0"/>
-          <w:i w:val="0"/>
-          <w:sz w:val="24"/>
-        </w:rPr>
-        <w:t xml:space="preserve">; Thường trú: </w:t>
-      </w:r>
-      <w:r>
-        <w:rPr>
-          <w:rFonts w:ascii="Times New Roman" w:hAnsi="Times New Roman" w:eastAsia="Times New Roman"/>
-          <w:b w:val="0"/>
-          <w:i w:val="0"/>
-          <w:sz w:val="24"/>
-        </w:rPr>
-        <w:t>{{landlord.permanentAddress}}</w:t>
-      </w:r>
-      <w:r>
-        <w:rPr>
-          <w:rFonts w:ascii="Times New Roman" w:hAnsi="Times New Roman" w:eastAsia="Times New Roman"/>
-          <w:b w:val="0"/>
-          <w:i w:val="0"/>
-          <w:sz w:val="24"/>
-        </w:rPr>
-        <w:t>.</w:t>
+        <w:t>CCCD/Hộ chiếu: {{landlord.idNumber}}; Thường trú: {{landlord.permanentAddress}}.</w:t>
       </w:r>
     </w:p>
     <w:p>
       <w:pPr>
         <w:keepNext w:val="0"/>
+        <w:widowControl/>
         <w:spacing w:before="0" w:after="80" w:line="276" w:lineRule="auto"/>
-        <w:jc w:val="both"/>
-        <w:widowControl w:val="1"/>
+        <w:ind w:left="0" w:firstLine="0"/>
+        <w:jc w:val="left"/>
       </w:pPr>
       <w:r>
         <w:rPr>
@@ -359,51 +278,16 @@
           <w:i w:val="0"/>
           <w:sz w:val="24"/>
         </w:rPr>
-        <w:t xml:space="preserve">Điện thoại: </w:t>
-      </w:r>
-      <w:r>
-        <w:rPr>
-          <w:rFonts w:ascii="Times New Roman" w:hAnsi="Times New Roman" w:eastAsia="Times New Roman"/>
-          <w:b w:val="0"/>
-          <w:i w:val="0"/>
-          <w:sz w:val="24"/>
-        </w:rPr>
-        <w:t>{{landlord.phone}}</w:t>
-      </w:r>
-      <w:r>
-        <w:rPr>
-          <w:rFonts w:ascii="Times New Roman" w:hAnsi="Times New Roman" w:eastAsia="Times New Roman"/>
-          <w:b w:val="0"/>
-          <w:i w:val="0"/>
-          <w:sz w:val="24"/>
-        </w:rPr>
-        <w:t xml:space="preserve">; Email: </w:t>
-      </w:r>
-      <w:r>
-        <w:rPr>
-          <w:rFonts w:ascii="Times New Roman" w:hAnsi="Times New Roman" w:eastAsia="Times New Roman"/>
-          <w:b w:val="0"/>
-          <w:i w:val="0"/>
-          <w:sz w:val="24"/>
-        </w:rPr>
-        <w:t>{{landlord.email}}</w:t>
-      </w:r>
-      <w:r>
-        <w:rPr>
-          <w:rFonts w:ascii="Times New Roman" w:hAnsi="Times New Roman" w:eastAsia="Times New Roman"/>
-          <w:b w:val="0"/>
-          <w:i w:val="0"/>
-          <w:sz w:val="24"/>
-        </w:rPr>
-        <w:t>.</w:t>
+        <w:t>Điện thoại: {{landlord.phone}}; Email: {{landlord.email}}.</w:t>
       </w:r>
     </w:p>
     <w:p>
       <w:pPr>
         <w:keepNext w:val="0"/>
+        <w:widowControl/>
         <w:spacing w:before="0" w:after="80" w:line="276" w:lineRule="auto"/>
-        <w:jc w:val="both"/>
-        <w:widowControl w:val="1"/>
+        <w:ind w:left="0" w:firstLine="0"/>
+        <w:jc w:val="left"/>
       </w:pPr>
       <w:r>
         <w:rPr>
@@ -412,69 +296,16 @@
           <w:i w:val="0"/>
           <w:sz w:val="24"/>
         </w:rPr>
-        <w:t xml:space="preserve">Tài khoản nhận thanh toán: Chủ tài khoản: </w:t>
-      </w:r>
-      <w:r>
-        <w:rPr>
-          <w:rFonts w:ascii="Times New Roman" w:hAnsi="Times New Roman" w:eastAsia="Times New Roman"/>
-          <w:b w:val="0"/>
-          <w:i w:val="0"/>
-          <w:sz w:val="24"/>
-        </w:rPr>
-        <w:t>{{landlord.bankAccountHolder}}</w:t>
-      </w:r>
-      <w:r>
-        <w:rPr>
-          <w:rFonts w:ascii="Times New Roman" w:hAnsi="Times New Roman" w:eastAsia="Times New Roman"/>
-          <w:b w:val="0"/>
-          <w:i w:val="0"/>
-          <w:sz w:val="24"/>
-        </w:rPr>
-        <w:t xml:space="preserve"> - Số tài khoản: </w:t>
-      </w:r>
-      <w:r>
-        <w:rPr>
-          <w:rFonts w:ascii="Times New Roman" w:hAnsi="Times New Roman" w:eastAsia="Times New Roman"/>
-          <w:b w:val="0"/>
-          <w:i w:val="0"/>
-          <w:sz w:val="24"/>
-        </w:rPr>
-        <w:t>{{landlord.bankAccountNumber}}</w:t>
-      </w:r>
-      <w:r>
-        <w:rPr>
-          <w:rFonts w:ascii="Times New Roman" w:hAnsi="Times New Roman" w:eastAsia="Times New Roman"/>
-          <w:b w:val="0"/>
-          <w:i w:val="0"/>
-          <w:sz w:val="24"/>
-        </w:rPr>
-        <w:t xml:space="preserve"> - Ngân hàng: </w:t>
-      </w:r>
-      <w:r>
-        <w:rPr>
-          <w:rFonts w:ascii="Times New Roman" w:hAnsi="Times New Roman" w:eastAsia="Times New Roman"/>
-          <w:b w:val="0"/>
-          <w:i w:val="0"/>
-          <w:sz w:val="24"/>
-        </w:rPr>
-        <w:t>{{landlord.bankName}}</w:t>
-      </w:r>
-      <w:r>
-        <w:rPr>
-          <w:rFonts w:ascii="Times New Roman" w:hAnsi="Times New Roman" w:eastAsia="Times New Roman"/>
-          <w:b w:val="0"/>
-          <w:i w:val="0"/>
-          <w:sz w:val="24"/>
-        </w:rPr>
-        <w:t>.</w:t>
+        <w:t>Tài khoản nhận thanh toán: Chủ tài khoản: {{landlord.bankAccountHolder}} - Số tài khoản: {{landlord.bankAccountNumber}} - Ngân hàng: {{landlord.bankName}}.</w:t>
       </w:r>
     </w:p>
     <w:p>
       <w:pPr>
         <w:keepNext w:val="0"/>
-        <w:spacing w:before="0" w:after="80" w:line="276" w:lineRule="auto"/>
-        <w:jc w:val="both"/>
-        <w:widowControl w:val="1"/>
+        <w:widowControl/>
+        <w:spacing w:before="60" w:after="40" w:line="276" w:lineRule="auto"/>
+        <w:ind w:left="0" w:firstLine="0"/>
+        <w:jc w:val="left"/>
       </w:pPr>
       <w:r>
         <w:rPr>
@@ -488,7 +319,7 @@
       <w:r>
         <w:rPr>
           <w:rFonts w:ascii="Times New Roman" w:hAnsi="Times New Roman" w:eastAsia="Times New Roman"/>
-          <w:b/>
+          <w:b w:val="0"/>
           <w:i w:val="0"/>
           <w:sz w:val="24"/>
         </w:rPr>
@@ -498,9 +329,10 @@
     <w:p>
       <w:pPr>
         <w:keepNext w:val="0"/>
+        <w:widowControl/>
         <w:spacing w:before="0" w:after="80" w:line="276" w:lineRule="auto"/>
-        <w:jc w:val="both"/>
-        <w:widowControl w:val="1"/>
+        <w:ind w:left="0" w:firstLine="0"/>
+        <w:jc w:val="left"/>
       </w:pPr>
       <w:r>
         <w:rPr>
@@ -509,51 +341,16 @@
           <w:i w:val="0"/>
           <w:sz w:val="24"/>
         </w:rPr>
-        <w:t xml:space="preserve">CCCD/Hộ chiếu: </w:t>
-      </w:r>
-      <w:r>
-        <w:rPr>
-          <w:rFonts w:ascii="Times New Roman" w:hAnsi="Times New Roman" w:eastAsia="Times New Roman"/>
-          <w:b w:val="0"/>
-          <w:i w:val="0"/>
-          <w:sz w:val="24"/>
-        </w:rPr>
-        <w:t>{{tenant.idNumber}}</w:t>
-      </w:r>
-      <w:r>
-        <w:rPr>
-          <w:rFonts w:ascii="Times New Roman" w:hAnsi="Times New Roman" w:eastAsia="Times New Roman"/>
-          <w:b w:val="0"/>
-          <w:i w:val="0"/>
-          <w:sz w:val="24"/>
-        </w:rPr>
-        <w:t xml:space="preserve">; Thường trú: </w:t>
-      </w:r>
-      <w:r>
-        <w:rPr>
-          <w:rFonts w:ascii="Times New Roman" w:hAnsi="Times New Roman" w:eastAsia="Times New Roman"/>
-          <w:b w:val="0"/>
-          <w:i w:val="0"/>
-          <w:sz w:val="24"/>
-        </w:rPr>
-        <w:t>{{tenant.permanentAddress}}</w:t>
-      </w:r>
-      <w:r>
-        <w:rPr>
-          <w:rFonts w:ascii="Times New Roman" w:hAnsi="Times New Roman" w:eastAsia="Times New Roman"/>
-          <w:b w:val="0"/>
-          <w:i w:val="0"/>
-          <w:sz w:val="24"/>
-        </w:rPr>
-        <w:t>.</w:t>
+        <w:t>CCCD/Hộ chiếu: {{tenant.idNumber}}; Thường trú: {{tenant.permanentAddress}}.</w:t>
       </w:r>
     </w:p>
     <w:p>
       <w:pPr>
         <w:keepNext w:val="0"/>
+        <w:widowControl/>
         <w:spacing w:before="0" w:after="80" w:line="276" w:lineRule="auto"/>
-        <w:jc w:val="both"/>
-        <w:widowControl w:val="1"/>
+        <w:ind w:left="0" w:firstLine="0"/>
+        <w:jc w:val="left"/>
       </w:pPr>
       <w:r>
         <w:rPr>
@@ -562,51 +359,16 @@
           <w:i w:val="0"/>
           <w:sz w:val="24"/>
         </w:rPr>
-        <w:t xml:space="preserve">Điện thoại: </w:t>
-      </w:r>
-      <w:r>
-        <w:rPr>
-          <w:rFonts w:ascii="Times New Roman" w:hAnsi="Times New Roman" w:eastAsia="Times New Roman"/>
-          <w:b w:val="0"/>
-          <w:i w:val="0"/>
-          <w:sz w:val="24"/>
-        </w:rPr>
-        <w:t>{{tenant.phone}}</w:t>
-      </w:r>
-      <w:r>
-        <w:rPr>
-          <w:rFonts w:ascii="Times New Roman" w:hAnsi="Times New Roman" w:eastAsia="Times New Roman"/>
-          <w:b w:val="0"/>
-          <w:i w:val="0"/>
-          <w:sz w:val="24"/>
-        </w:rPr>
-        <w:t xml:space="preserve">; Email: </w:t>
-      </w:r>
-      <w:r>
-        <w:rPr>
-          <w:rFonts w:ascii="Times New Roman" w:hAnsi="Times New Roman" w:eastAsia="Times New Roman"/>
-          <w:b w:val="0"/>
-          <w:i w:val="0"/>
-          <w:sz w:val="24"/>
-        </w:rPr>
-        <w:t>{{tenant.email}}</w:t>
-      </w:r>
-      <w:r>
-        <w:rPr>
-          <w:rFonts w:ascii="Times New Roman" w:hAnsi="Times New Roman" w:eastAsia="Times New Roman"/>
-          <w:b w:val="0"/>
-          <w:i w:val="0"/>
-          <w:sz w:val="24"/>
-        </w:rPr>
-        <w:t>.</w:t>
+        <w:t>Điện thoại: {{tenant.phone}}; Email: {{tenant.email}}.</w:t>
       </w:r>
     </w:p>
     <w:p>
       <w:pPr>
         <w:keepNext w:val="0"/>
+        <w:widowControl/>
         <w:spacing w:before="0" w:after="80" w:line="276" w:lineRule="auto"/>
-        <w:jc w:val="both"/>
-        <w:widowControl w:val="1"/>
+        <w:ind w:left="0" w:firstLine="0"/>
+        <w:jc w:val="left"/>
       </w:pPr>
       <w:r>
         <w:rPr>
@@ -615,69 +377,16 @@
           <w:i w:val="0"/>
           <w:sz w:val="24"/>
         </w:rPr>
-        <w:t xml:space="preserve">Số người cư trú: </w:t>
-      </w:r>
-      <w:r>
-        <w:rPr>
-          <w:rFonts w:ascii="Times New Roman" w:hAnsi="Times New Roman" w:eastAsia="Times New Roman"/>
-          <w:b w:val="0"/>
-          <w:i w:val="0"/>
-          <w:sz w:val="24"/>
-        </w:rPr>
-        <w:t>{{tenant.occupantCount}}</w:t>
-      </w:r>
-      <w:r>
-        <w:rPr>
-          <w:rFonts w:ascii="Times New Roman" w:hAnsi="Times New Roman" w:eastAsia="Times New Roman"/>
-          <w:b w:val="0"/>
-          <w:i w:val="0"/>
-          <w:sz w:val="24"/>
-        </w:rPr>
-        <w:t xml:space="preserve">; Xe máy đăng ký: </w:t>
-      </w:r>
-      <w:r>
-        <w:rPr>
-          <w:rFonts w:ascii="Times New Roman" w:hAnsi="Times New Roman" w:eastAsia="Times New Roman"/>
-          <w:b w:val="0"/>
-          <w:i w:val="0"/>
-          <w:sz w:val="24"/>
-        </w:rPr>
-        <w:t>{{tenant.motorbikeCount}}</w:t>
-      </w:r>
-      <w:r>
-        <w:rPr>
-          <w:rFonts w:ascii="Times New Roman" w:hAnsi="Times New Roman" w:eastAsia="Times New Roman"/>
-          <w:b w:val="0"/>
-          <w:i w:val="0"/>
-          <w:sz w:val="24"/>
-        </w:rPr>
-        <w:t xml:space="preserve">; Ô tô đăng ký: </w:t>
-      </w:r>
-      <w:r>
-        <w:rPr>
-          <w:rFonts w:ascii="Times New Roman" w:hAnsi="Times New Roman" w:eastAsia="Times New Roman"/>
-          <w:b w:val="0"/>
-          <w:i w:val="0"/>
-          <w:sz w:val="24"/>
-        </w:rPr>
-        <w:t>{{tenant.carCount}}</w:t>
-      </w:r>
-      <w:r>
-        <w:rPr>
-          <w:rFonts w:ascii="Times New Roman" w:hAnsi="Times New Roman" w:eastAsia="Times New Roman"/>
-          <w:b w:val="0"/>
-          <w:i w:val="0"/>
-          <w:sz w:val="24"/>
-        </w:rPr>
-        <w:t>.</w:t>
+        <w:t>Số người cư trú: {{tenant.occupantCount}}; Xe máy đăng ký: {{tenant.motorbikeCount}}; Ô tô đăng ký: {{tenant.carCount}}.</w:t>
       </w:r>
     </w:p>
     <w:p>
       <w:pPr>
         <w:keepNext w:val="0"/>
+        <w:widowControl/>
         <w:spacing w:before="0" w:after="80" w:line="276" w:lineRule="auto"/>
-        <w:jc w:val="both"/>
-        <w:widowControl w:val="1"/>
+        <w:ind w:left="0" w:firstLine="0"/>
+        <w:jc w:val="left"/>
       </w:pPr>
       <w:r>
         <w:rPr>
@@ -686,69 +395,16 @@
           <w:i w:val="0"/>
           <w:sz w:val="24"/>
         </w:rPr>
-        <w:t xml:space="preserve">Tài khoản nhận hoàn trả: Chủ tài khoản: </w:t>
-      </w:r>
-      <w:r>
-        <w:rPr>
-          <w:rFonts w:ascii="Times New Roman" w:hAnsi="Times New Roman" w:eastAsia="Times New Roman"/>
-          <w:b w:val="0"/>
-          <w:i w:val="0"/>
-          <w:sz w:val="24"/>
-        </w:rPr>
-        <w:t>{{tenant.bankAccountHolder}}</w:t>
-      </w:r>
-      <w:r>
-        <w:rPr>
-          <w:rFonts w:ascii="Times New Roman" w:hAnsi="Times New Roman" w:eastAsia="Times New Roman"/>
-          <w:b w:val="0"/>
-          <w:i w:val="0"/>
-          <w:sz w:val="24"/>
-        </w:rPr>
-        <w:t xml:space="preserve"> - Số tài khoản: </w:t>
-      </w:r>
-      <w:r>
-        <w:rPr>
-          <w:rFonts w:ascii="Times New Roman" w:hAnsi="Times New Roman" w:eastAsia="Times New Roman"/>
-          <w:b w:val="0"/>
-          <w:i w:val="0"/>
-          <w:sz w:val="24"/>
-        </w:rPr>
-        <w:t>{{tenant.bankAccountNumber}}</w:t>
-      </w:r>
-      <w:r>
-        <w:rPr>
-          <w:rFonts w:ascii="Times New Roman" w:hAnsi="Times New Roman" w:eastAsia="Times New Roman"/>
-          <w:b w:val="0"/>
-          <w:i w:val="0"/>
-          <w:sz w:val="24"/>
-        </w:rPr>
-        <w:t xml:space="preserve"> - Ngân hàng: </w:t>
-      </w:r>
-      <w:r>
-        <w:rPr>
-          <w:rFonts w:ascii="Times New Roman" w:hAnsi="Times New Roman" w:eastAsia="Times New Roman"/>
-          <w:b w:val="0"/>
-          <w:i w:val="0"/>
-          <w:sz w:val="24"/>
-        </w:rPr>
-        <w:t>{{tenant.bankName}}</w:t>
-      </w:r>
-      <w:r>
-        <w:rPr>
-          <w:rFonts w:ascii="Times New Roman" w:hAnsi="Times New Roman" w:eastAsia="Times New Roman"/>
-          <w:b w:val="0"/>
-          <w:i w:val="0"/>
-          <w:sz w:val="24"/>
-        </w:rPr>
-        <w:t>.</w:t>
+        <w:t>Tài khoản nhận hoàn trả: Chủ tài khoản: {{tenant.bankAccountHolder}} - Số tài khoản: {{tenant.bankAccountNumber}} - Ngân hàng: {{tenant.bankName}}.</w:t>
       </w:r>
     </w:p>
     <w:p>
       <w:pPr>
         <w:keepNext/>
+        <w:widowControl/>
         <w:spacing w:before="160" w:after="80" w:line="276" w:lineRule="auto"/>
-        <w:jc w:val="both"/>
-        <w:widowControl w:val="1"/>
+        <w:ind w:left="0" w:firstLine="0"/>
+        <w:jc w:val="left"/>
       </w:pPr>
       <w:r>
         <w:rPr>
@@ -763,9 +419,10 @@
     <w:p>
       <w:pPr>
         <w:keepNext w:val="0"/>
+        <w:widowControl/>
         <w:spacing w:before="0" w:after="80" w:line="276" w:lineRule="auto"/>
+        <w:ind w:left="0" w:firstLine="0"/>
         <w:jc w:val="both"/>
-        <w:widowControl w:val="1"/>
       </w:pPr>
       <w:r>
         <w:rPr>
@@ -774,33 +431,16 @@
           <w:i w:val="0"/>
           <w:sz w:val="24"/>
         </w:rPr>
-        <w:t xml:space="preserve">1.1. Bên A đồng ý cho Bên B thuê toàn bộ căn nhà tại địa chỉ: </w:t>
-      </w:r>
-      <w:r>
-        <w:rPr>
-          <w:rFonts w:ascii="Times New Roman" w:hAnsi="Times New Roman" w:eastAsia="Times New Roman"/>
-          <w:b w:val="0"/>
-          <w:i w:val="0"/>
-          <w:sz w:val="24"/>
-        </w:rPr>
-        <w:t>{{property.fullAddress}}</w:t>
-      </w:r>
-      <w:r>
-        <w:rPr>
-          <w:rFonts w:ascii="Times New Roman" w:hAnsi="Times New Roman" w:eastAsia="Times New Roman"/>
-          <w:b w:val="0"/>
-          <w:i w:val="0"/>
-          <w:sz w:val="24"/>
-        </w:rPr>
-        <w:t>.</w:t>
+        <w:t>1.1. Bên A đồng ý cho Bên B thuê toàn bộ căn nhà tại địa chỉ: {{property.fullAddress}}.</w:t>
       </w:r>
     </w:p>
     <w:p>
       <w:pPr>
         <w:keepNext w:val="0"/>
+        <w:widowControl/>
         <w:spacing w:before="0" w:after="80" w:line="276" w:lineRule="auto"/>
+        <w:ind w:left="0" w:firstLine="0"/>
         <w:jc w:val="both"/>
-        <w:widowControl w:val="1"/>
       </w:pPr>
       <w:r>
         <w:rPr>
@@ -809,105 +449,16 @@
           <w:i w:val="0"/>
           <w:sz w:val="24"/>
         </w:rPr>
-        <w:t xml:space="preserve">1.2. Diện tích: </w:t>
-      </w:r>
-      <w:r>
-        <w:rPr>
-          <w:rFonts w:ascii="Times New Roman" w:hAnsi="Times New Roman" w:eastAsia="Times New Roman"/>
-          <w:b w:val="0"/>
-          <w:i w:val="0"/>
-          <w:sz w:val="24"/>
-        </w:rPr>
-        <w:t>{{property.areaText}}</w:t>
-      </w:r>
-      <w:r>
-        <w:rPr>
-          <w:rFonts w:ascii="Times New Roman" w:hAnsi="Times New Roman" w:eastAsia="Times New Roman"/>
-          <w:b w:val="0"/>
-          <w:i w:val="0"/>
-          <w:sz w:val="24"/>
-        </w:rPr>
-        <w:t xml:space="preserve">; Kết cấu/Số tầng: </w:t>
-      </w:r>
-      <w:r>
-        <w:rPr>
-          <w:rFonts w:ascii="Times New Roman" w:hAnsi="Times New Roman" w:eastAsia="Times New Roman"/>
-          <w:b w:val="0"/>
-          <w:i w:val="0"/>
-          <w:sz w:val="24"/>
-        </w:rPr>
-        <w:t>{{property.floor}}</w:t>
-      </w:r>
-      <w:r>
-        <w:rPr>
-          <w:rFonts w:ascii="Times New Roman" w:hAnsi="Times New Roman" w:eastAsia="Times New Roman"/>
-          <w:b w:val="0"/>
-          <w:i w:val="0"/>
-          <w:sz w:val="24"/>
-        </w:rPr>
-        <w:t xml:space="preserve">; Loại tài sản: </w:t>
-      </w:r>
-      <w:r>
-        <w:rPr>
-          <w:rFonts w:ascii="Times New Roman" w:hAnsi="Times New Roman" w:eastAsia="Times New Roman"/>
-          <w:b w:val="0"/>
-          <w:i w:val="0"/>
-          <w:sz w:val="24"/>
-        </w:rPr>
-        <w:t>{{property.propertyType}}</w:t>
-      </w:r>
-      <w:r>
-        <w:rPr>
-          <w:rFonts w:ascii="Times New Roman" w:hAnsi="Times New Roman" w:eastAsia="Times New Roman"/>
-          <w:b w:val="0"/>
-          <w:i w:val="0"/>
-          <w:sz w:val="24"/>
-        </w:rPr>
-        <w:t xml:space="preserve">; Phạm vi thuê: </w:t>
-      </w:r>
-      <w:r>
-        <w:rPr>
-          <w:rFonts w:ascii="Times New Roman" w:hAnsi="Times New Roman" w:eastAsia="Times New Roman"/>
-          <w:b w:val="0"/>
-          <w:i w:val="0"/>
-          <w:sz w:val="24"/>
-        </w:rPr>
-        <w:t>{{property.rentalScope}}</w:t>
-      </w:r>
-      <w:r>
-        <w:rPr>
-          <w:rFonts w:ascii="Times New Roman" w:hAnsi="Times New Roman" w:eastAsia="Times New Roman"/>
-          <w:b w:val="0"/>
-          <w:i w:val="0"/>
-          <w:sz w:val="24"/>
-        </w:rPr>
-        <w:t xml:space="preserve">; Mã tin: </w:t>
-      </w:r>
-      <w:r>
-        <w:rPr>
-          <w:rFonts w:ascii="Times New Roman" w:hAnsi="Times New Roman" w:eastAsia="Times New Roman"/>
-          <w:b w:val="0"/>
-          <w:i w:val="0"/>
-          <w:sz w:val="24"/>
-        </w:rPr>
-        <w:t>{{property.listingCode}}</w:t>
-      </w:r>
-      <w:r>
-        <w:rPr>
-          <w:rFonts w:ascii="Times New Roman" w:hAnsi="Times New Roman" w:eastAsia="Times New Roman"/>
-          <w:b w:val="0"/>
-          <w:i w:val="0"/>
-          <w:sz w:val="24"/>
-        </w:rPr>
-        <w:t>.</w:t>
+        <w:t>1.2. Diện tích: {{property.areaText}}; Kết cấu/Số tầng: {{property.floor}}; Loại tài sản: {{property.propertyType}}; Phạm vi thuê: {{property.rentalScope}}; Mã tin: {{property.listingCode}}.</w:t>
       </w:r>
     </w:p>
     <w:p>
       <w:pPr>
         <w:keepNext w:val="0"/>
+        <w:widowControl/>
         <w:spacing w:before="0" w:after="80" w:line="276" w:lineRule="auto"/>
+        <w:ind w:left="0" w:firstLine="0"/>
         <w:jc w:val="both"/>
-        <w:widowControl w:val="1"/>
       </w:pPr>
       <w:r>
         <w:rPr>
@@ -916,56 +467,21 @@
           <w:i w:val="0"/>
           <w:sz w:val="24"/>
         </w:rPr>
-        <w:t xml:space="preserve">1.3. Số người tối đa cho phép: </w:t>
-      </w:r>
-      <w:r>
-        <w:rPr>
-          <w:rFonts w:ascii="Times New Roman" w:hAnsi="Times New Roman" w:eastAsia="Times New Roman"/>
-          <w:b w:val="0"/>
-          <w:i w:val="0"/>
-          <w:sz w:val="24"/>
-        </w:rPr>
-        <w:t>{{property.maxOccupants}}</w:t>
-      </w:r>
-      <w:r>
-        <w:rPr>
-          <w:rFonts w:ascii="Times New Roman" w:hAnsi="Times New Roman" w:eastAsia="Times New Roman"/>
-          <w:b w:val="0"/>
-          <w:i w:val="0"/>
-          <w:sz w:val="24"/>
-        </w:rPr>
-        <w:t xml:space="preserve">; Số xe tối đa cho phép: </w:t>
-      </w:r>
-      <w:r>
-        <w:rPr>
-          <w:rFonts w:ascii="Times New Roman" w:hAnsi="Times New Roman" w:eastAsia="Times New Roman"/>
-          <w:b w:val="0"/>
-          <w:i w:val="0"/>
-          <w:sz w:val="24"/>
-        </w:rPr>
-        <w:t>{{property.maxVehicles}}</w:t>
-      </w:r>
-      <w:r>
-        <w:rPr>
-          <w:rFonts w:ascii="Times New Roman" w:hAnsi="Times New Roman" w:eastAsia="Times New Roman"/>
-          <w:b w:val="0"/>
-          <w:i w:val="0"/>
-          <w:sz w:val="24"/>
-        </w:rPr>
-        <w:t>.</w:t>
+        <w:t>1.3. Số người tối đa cho phép: {{property.maxOccupants}}; Số xe tối đa cho phép: {{property.maxVehicles}}.</w:t>
       </w:r>
     </w:p>
     <w:p>
       <w:pPr>
         <w:keepNext/>
-        <w:spacing w:before="0" w:after="40" w:line="276" w:lineRule="auto"/>
+        <w:widowControl/>
+        <w:spacing w:before="0" w:after="80" w:line="276" w:lineRule="auto"/>
+        <w:ind w:left="0" w:firstLine="0"/>
         <w:jc w:val="both"/>
-        <w:widowControl w:val="1"/>
       </w:pPr>
       <w:r>
         <w:rPr>
           <w:rFonts w:ascii="Times New Roman" w:hAnsi="Times New Roman" w:eastAsia="Times New Roman"/>
-          <w:b/>
+          <w:b w:val="0"/>
           <w:i w:val="0"/>
           <w:sz w:val="24"/>
         </w:rPr>
@@ -975,14 +491,15 @@
     <w:p>
       <w:pPr>
         <w:keepNext w:val="0"/>
-        <w:spacing w:before="0" w:after="80" w:line="276" w:lineRule="auto"/>
-        <w:jc w:val="center"/>
-        <w:widowControl w:val="1"/>
+        <w:widowControl/>
+        <w:spacing w:before="20" w:after="100" w:line="276" w:lineRule="auto"/>
+        <w:ind w:left="0" w:firstLine="0"/>
+        <w:jc w:val="left"/>
       </w:pPr>
       <w:r>
         <w:rPr>
           <w:rFonts w:ascii="Times New Roman" w:hAnsi="Times New Roman" w:eastAsia="Times New Roman"/>
-          <w:b/>
+          <w:b w:val="0"/>
           <w:i w:val="0"/>
           <w:sz w:val="24"/>
         </w:rPr>
@@ -992,9 +509,10 @@
     <w:p>
       <w:pPr>
         <w:keepNext w:val="0"/>
+        <w:widowControl/>
         <w:spacing w:before="0" w:after="80" w:line="276" w:lineRule="auto"/>
+        <w:ind w:left="0" w:firstLine="0"/>
         <w:jc w:val="both"/>
-        <w:widowControl w:val="1"/>
       </w:pPr>
       <w:r>
         <w:rPr>
@@ -1009,9 +527,10 @@
     <w:p>
       <w:pPr>
         <w:keepNext/>
+        <w:widowControl/>
         <w:spacing w:before="160" w:after="80" w:line="276" w:lineRule="auto"/>
-        <w:jc w:val="both"/>
-        <w:widowControl w:val="1"/>
+        <w:ind w:left="0" w:firstLine="0"/>
+        <w:jc w:val="left"/>
       </w:pPr>
       <w:r>
         <w:rPr>
@@ -1026,9 +545,10 @@
     <w:p>
       <w:pPr>
         <w:keepNext w:val="0"/>
+        <w:widowControl/>
         <w:spacing w:before="0" w:after="80" w:line="276" w:lineRule="auto"/>
+        <w:ind w:left="0" w:firstLine="0"/>
         <w:jc w:val="both"/>
-        <w:widowControl w:val="1"/>
       </w:pPr>
       <w:r>
         <w:rPr>
@@ -1037,87 +557,16 @@
           <w:i w:val="0"/>
           <w:sz w:val="24"/>
         </w:rPr>
-        <w:t xml:space="preserve">2.1. Thời hạn thuê: </w:t>
-      </w:r>
-      <w:r>
-        <w:rPr>
-          <w:rFonts w:ascii="Times New Roman" w:hAnsi="Times New Roman" w:eastAsia="Times New Roman"/>
-          <w:b w:val="0"/>
-          <w:i w:val="0"/>
-          <w:sz w:val="24"/>
-        </w:rPr>
-        <w:t>{{lease.durationText}}</w:t>
-      </w:r>
-      <w:r>
-        <w:rPr>
-          <w:rFonts w:ascii="Times New Roman" w:hAnsi="Times New Roman" w:eastAsia="Times New Roman"/>
-          <w:b w:val="0"/>
-          <w:i w:val="0"/>
-          <w:sz w:val="24"/>
-        </w:rPr>
-        <w:t xml:space="preserve"> (</w:t>
-      </w:r>
-      <w:r>
-        <w:rPr>
-          <w:rFonts w:ascii="Times New Roman" w:hAnsi="Times New Roman" w:eastAsia="Times New Roman"/>
-          <w:b w:val="0"/>
-          <w:i w:val="0"/>
-          <w:sz w:val="24"/>
-        </w:rPr>
-        <w:t>{{lease.durationMonths}}</w:t>
-      </w:r>
-      <w:r>
-        <w:rPr>
-          <w:rFonts w:ascii="Times New Roman" w:hAnsi="Times New Roman" w:eastAsia="Times New Roman"/>
-          <w:b w:val="0"/>
-          <w:i w:val="0"/>
-          <w:sz w:val="24"/>
-        </w:rPr>
-        <w:t xml:space="preserve"> tháng), từ ngày </w:t>
-      </w:r>
-      <w:r>
-        <w:rPr>
-          <w:rFonts w:ascii="Times New Roman" w:hAnsi="Times New Roman" w:eastAsia="Times New Roman"/>
-          <w:b w:val="0"/>
-          <w:i w:val="0"/>
-          <w:sz w:val="24"/>
-        </w:rPr>
-        <w:t>{{lease.startDateText}}</w:t>
-      </w:r>
-      <w:r>
-        <w:rPr>
-          <w:rFonts w:ascii="Times New Roman" w:hAnsi="Times New Roman" w:eastAsia="Times New Roman"/>
-          <w:b w:val="0"/>
-          <w:i w:val="0"/>
-          <w:sz w:val="24"/>
-        </w:rPr>
-        <w:t xml:space="preserve"> đến ngày </w:t>
-      </w:r>
-      <w:r>
-        <w:rPr>
-          <w:rFonts w:ascii="Times New Roman" w:hAnsi="Times New Roman" w:eastAsia="Times New Roman"/>
-          <w:b w:val="0"/>
-          <w:i w:val="0"/>
-          <w:sz w:val="24"/>
-        </w:rPr>
-        <w:t>{{lease.endDateText}}</w:t>
-      </w:r>
-      <w:r>
-        <w:rPr>
-          <w:rFonts w:ascii="Times New Roman" w:hAnsi="Times New Roman" w:eastAsia="Times New Roman"/>
-          <w:b w:val="0"/>
-          <w:i w:val="0"/>
-          <w:sz w:val="24"/>
-        </w:rPr>
-        <w:t>.</w:t>
+        <w:t>2.1. Thời hạn thuê: {{lease.durationText}} ({{lease.durationMonths}} tháng), từ ngày {{lease.startDateText}} đến ngày {{lease.endDateText}}.</w:t>
       </w:r>
     </w:p>
     <w:p>
       <w:pPr>
         <w:keepNext w:val="0"/>
+        <w:widowControl/>
         <w:spacing w:before="0" w:after="80" w:line="276" w:lineRule="auto"/>
+        <w:ind w:left="0" w:firstLine="0"/>
         <w:jc w:val="both"/>
-        <w:widowControl w:val="1"/>
       </w:pPr>
       <w:r>
         <w:rPr>
@@ -1126,33 +575,16 @@
           <w:i w:val="0"/>
           <w:sz w:val="24"/>
         </w:rPr>
-        <w:t xml:space="preserve">2.2. Ngày bàn giao: </w:t>
-      </w:r>
-      <w:r>
-        <w:rPr>
-          <w:rFonts w:ascii="Times New Roman" w:hAnsi="Times New Roman" w:eastAsia="Times New Roman"/>
-          <w:b w:val="0"/>
-          <w:i w:val="0"/>
-          <w:sz w:val="24"/>
-        </w:rPr>
-        <w:t>{{lease.handoverDateText}}</w:t>
-      </w:r>
-      <w:r>
-        <w:rPr>
-          <w:rFonts w:ascii="Times New Roman" w:hAnsi="Times New Roman" w:eastAsia="Times New Roman"/>
-          <w:b w:val="0"/>
-          <w:i w:val="0"/>
-          <w:sz w:val="24"/>
-        </w:rPr>
-        <w:t>.</w:t>
+        <w:t>2.2. Ngày bàn giao: {{lease.handoverDateText}}.</w:t>
       </w:r>
     </w:p>
     <w:p>
       <w:pPr>
         <w:keepNext w:val="0"/>
+        <w:widowControl/>
         <w:spacing w:before="0" w:after="80" w:line="276" w:lineRule="auto"/>
+        <w:ind w:left="0" w:firstLine="0"/>
         <w:jc w:val="both"/>
-        <w:widowControl w:val="1"/>
       </w:pPr>
       <w:r>
         <w:rPr>
@@ -1161,51 +593,16 @@
           <w:i w:val="0"/>
           <w:sz w:val="24"/>
         </w:rPr>
-        <w:t xml:space="preserve">2.3. Bàn giao chỉ số công tơ điện ban đầu: </w:t>
-      </w:r>
-      <w:r>
-        <w:rPr>
-          <w:rFonts w:ascii="Times New Roman" w:hAnsi="Times New Roman" w:eastAsia="Times New Roman"/>
-          <w:b w:val="0"/>
-          <w:i w:val="0"/>
-          <w:sz w:val="24"/>
-        </w:rPr>
-        <w:t>{{meters.electricityInitial}}</w:t>
-      </w:r>
-      <w:r>
-        <w:rPr>
-          <w:rFonts w:ascii="Times New Roman" w:hAnsi="Times New Roman" w:eastAsia="Times New Roman"/>
-          <w:b w:val="0"/>
-          <w:i w:val="0"/>
-          <w:sz w:val="24"/>
-        </w:rPr>
-        <w:t xml:space="preserve">; nước ban đầu: </w:t>
-      </w:r>
-      <w:r>
-        <w:rPr>
-          <w:rFonts w:ascii="Times New Roman" w:hAnsi="Times New Roman" w:eastAsia="Times New Roman"/>
-          <w:b w:val="0"/>
-          <w:i w:val="0"/>
-          <w:sz w:val="24"/>
-        </w:rPr>
-        <w:t>{{meters.waterInitial}}</w:t>
-      </w:r>
-      <w:r>
-        <w:rPr>
-          <w:rFonts w:ascii="Times New Roman" w:hAnsi="Times New Roman" w:eastAsia="Times New Roman"/>
-          <w:b w:val="0"/>
-          <w:i w:val="0"/>
-          <w:sz w:val="24"/>
-        </w:rPr>
-        <w:t xml:space="preserve"> (nếu chưa có sẽ lập tại Biên bản bàn giao khi nhận nhà).</w:t>
+        <w:t>2.3. Bàn giao chỉ số công tơ điện ban đầu: {{meters.electricityInitial}}; nước ban đầu: {{meters.waterInitial}} (nếu chưa có sẽ lập tại Biên bản bàn giao khi nhận nhà).</w:t>
       </w:r>
     </w:p>
     <w:p>
       <w:pPr>
         <w:keepNext/>
+        <w:widowControl/>
         <w:spacing w:before="160" w:after="80" w:line="276" w:lineRule="auto"/>
-        <w:jc w:val="both"/>
-        <w:widowControl w:val="1"/>
+        <w:ind w:left="0" w:firstLine="0"/>
+        <w:jc w:val="left"/>
       </w:pPr>
       <w:r>
         <w:rPr>
@@ -1220,9 +617,10 @@
     <w:p>
       <w:pPr>
         <w:keepNext w:val="0"/>
+        <w:widowControl/>
         <w:spacing w:before="0" w:after="80" w:line="276" w:lineRule="auto"/>
+        <w:ind w:left="0" w:firstLine="0"/>
         <w:jc w:val="both"/>
-        <w:widowControl w:val="1"/>
       </w:pPr>
       <w:r>
         <w:rPr>
@@ -1231,51 +629,16 @@
           <w:i w:val="0"/>
           <w:sz w:val="24"/>
         </w:rPr>
-        <w:t xml:space="preserve">3.1. Giá thuê: </w:t>
-      </w:r>
-      <w:r>
-        <w:rPr>
-          <w:rFonts w:ascii="Times New Roman" w:hAnsi="Times New Roman" w:eastAsia="Times New Roman"/>
-          <w:b w:val="0"/>
-          <w:i w:val="0"/>
-          <w:sz w:val="24"/>
-        </w:rPr>
-        <w:t>{{rent.amountNumber}}</w:t>
-      </w:r>
-      <w:r>
-        <w:rPr>
-          <w:rFonts w:ascii="Times New Roman" w:hAnsi="Times New Roman" w:eastAsia="Times New Roman"/>
-          <w:b w:val="0"/>
-          <w:i w:val="0"/>
-          <w:sz w:val="24"/>
-        </w:rPr>
-        <w:t xml:space="preserve"> VNĐ/tháng (Bằng chữ: </w:t>
-      </w:r>
-      <w:r>
-        <w:rPr>
-          <w:rFonts w:ascii="Times New Roman" w:hAnsi="Times New Roman" w:eastAsia="Times New Roman"/>
-          <w:b w:val="0"/>
-          <w:i w:val="0"/>
-          <w:sz w:val="24"/>
-        </w:rPr>
-        <w:t>{{rent.amountWords}}</w:t>
-      </w:r>
-      <w:r>
-        <w:rPr>
-          <w:rFonts w:ascii="Times New Roman" w:hAnsi="Times New Roman" w:eastAsia="Times New Roman"/>
-          <w:b w:val="0"/>
-          <w:i w:val="0"/>
-          <w:sz w:val="24"/>
-        </w:rPr>
-        <w:t>).</w:t>
+        <w:t>3.1. Giá thuê: {{rent.amountNumber}} (Bằng chữ: {{rent.amountWords}}).</w:t>
       </w:r>
     </w:p>
     <w:p>
       <w:pPr>
         <w:keepNext w:val="0"/>
+        <w:widowControl/>
         <w:spacing w:before="0" w:after="80" w:line="276" w:lineRule="auto"/>
+        <w:ind w:left="0" w:firstLine="0"/>
         <w:jc w:val="both"/>
-        <w:widowControl w:val="1"/>
       </w:pPr>
       <w:r>
         <w:rPr>
@@ -1284,51 +647,16 @@
           <w:i w:val="0"/>
           <w:sz w:val="24"/>
         </w:rPr>
-        <w:t xml:space="preserve">3.2. Chu kỳ thanh toán: </w:t>
-      </w:r>
-      <w:r>
-        <w:rPr>
-          <w:rFonts w:ascii="Times New Roman" w:hAnsi="Times New Roman" w:eastAsia="Times New Roman"/>
-          <w:b w:val="0"/>
-          <w:i w:val="0"/>
-          <w:sz w:val="24"/>
-        </w:rPr>
-        <w:t>{{rent.paymentCycle}}</w:t>
-      </w:r>
-      <w:r>
-        <w:rPr>
-          <w:rFonts w:ascii="Times New Roman" w:hAnsi="Times New Roman" w:eastAsia="Times New Roman"/>
-          <w:b w:val="0"/>
-          <w:i w:val="0"/>
-          <w:sz w:val="24"/>
-        </w:rPr>
-        <w:t xml:space="preserve">; Hạn thanh toán định kỳ: </w:t>
-      </w:r>
-      <w:r>
-        <w:rPr>
-          <w:rFonts w:ascii="Times New Roman" w:hAnsi="Times New Roman" w:eastAsia="Times New Roman"/>
-          <w:b w:val="0"/>
-          <w:i w:val="0"/>
-          <w:sz w:val="24"/>
-        </w:rPr>
-        <w:t>{{rent.paymentDueDay}}</w:t>
-      </w:r>
-      <w:r>
-        <w:rPr>
-          <w:rFonts w:ascii="Times New Roman" w:hAnsi="Times New Roman" w:eastAsia="Times New Roman"/>
-          <w:b w:val="0"/>
-          <w:i w:val="0"/>
-          <w:sz w:val="24"/>
-        </w:rPr>
-        <w:t>.</w:t>
+        <w:t>3.2. Chu kỳ thanh toán: {{rent.paymentCycle}}; Hạn thanh toán định kỳ: {{rent.paymentDueDay}}.</w:t>
       </w:r>
     </w:p>
     <w:p>
       <w:pPr>
         <w:keepNext w:val="0"/>
+        <w:widowControl/>
         <w:spacing w:before="0" w:after="80" w:line="276" w:lineRule="auto"/>
+        <w:ind w:left="0" w:firstLine="0"/>
         <w:jc w:val="both"/>
-        <w:widowControl w:val="1"/>
       </w:pPr>
       <w:r>
         <w:rPr>
@@ -1337,33 +665,16 @@
           <w:i w:val="0"/>
           <w:sz w:val="24"/>
         </w:rPr>
-        <w:t xml:space="preserve">3.3. Phương thức thanh toán: </w:t>
-      </w:r>
-      <w:r>
-        <w:rPr>
-          <w:rFonts w:ascii="Times New Roman" w:hAnsi="Times New Roman" w:eastAsia="Times New Roman"/>
-          <w:b w:val="0"/>
-          <w:i w:val="0"/>
-          <w:sz w:val="24"/>
-        </w:rPr>
-        <w:t>{{rent.paymentMethod}}</w:t>
-      </w:r>
-      <w:r>
-        <w:rPr>
-          <w:rFonts w:ascii="Times New Roman" w:hAnsi="Times New Roman" w:eastAsia="Times New Roman"/>
-          <w:b w:val="0"/>
-          <w:i w:val="0"/>
-          <w:sz w:val="24"/>
-        </w:rPr>
-        <w:t>.</w:t>
+        <w:t>3.3. Phương thức thanh toán: {{rent.paymentMethod}}.</w:t>
       </w:r>
     </w:p>
     <w:p>
       <w:pPr>
         <w:keepNext w:val="0"/>
+        <w:widowControl/>
         <w:spacing w:before="0" w:after="80" w:line="276" w:lineRule="auto"/>
+        <w:ind w:left="0" w:firstLine="0"/>
         <w:jc w:val="both"/>
-        <w:widowControl w:val="1"/>
       </w:pPr>
       <w:r>
         <w:rPr>
@@ -1372,51 +683,16 @@
           <w:i w:val="0"/>
           <w:sz w:val="24"/>
         </w:rPr>
-        <w:t xml:space="preserve">3.4. Tiền đặt cọc: </w:t>
-      </w:r>
-      <w:r>
-        <w:rPr>
-          <w:rFonts w:ascii="Times New Roman" w:hAnsi="Times New Roman" w:eastAsia="Times New Roman"/>
-          <w:b w:val="0"/>
-          <w:i w:val="0"/>
-          <w:sz w:val="24"/>
-        </w:rPr>
-        <w:t>{{deposit.amountNumber}}</w:t>
-      </w:r>
-      <w:r>
-        <w:rPr>
-          <w:rFonts w:ascii="Times New Roman" w:hAnsi="Times New Roman" w:eastAsia="Times New Roman"/>
-          <w:b w:val="0"/>
-          <w:i w:val="0"/>
-          <w:sz w:val="24"/>
-        </w:rPr>
-        <w:t xml:space="preserve"> VNĐ (Bằng chữ: </w:t>
-      </w:r>
-      <w:r>
-        <w:rPr>
-          <w:rFonts w:ascii="Times New Roman" w:hAnsi="Times New Roman" w:eastAsia="Times New Roman"/>
-          <w:b w:val="0"/>
-          <w:i w:val="0"/>
-          <w:sz w:val="24"/>
-        </w:rPr>
-        <w:t>{{deposit.amountWords}}</w:t>
-      </w:r>
-      <w:r>
-        <w:rPr>
-          <w:rFonts w:ascii="Times New Roman" w:hAnsi="Times New Roman" w:eastAsia="Times New Roman"/>
-          <w:b w:val="0"/>
-          <w:i w:val="0"/>
-          <w:sz w:val="24"/>
-        </w:rPr>
-        <w:t>).</w:t>
+        <w:t>3.4. Tiền đặt cọc: {{deposit.amountNumber}} (Bằng chữ: {{deposit.amountWords}}).</w:t>
       </w:r>
     </w:p>
     <w:p>
       <w:pPr>
         <w:keepNext w:val="0"/>
+        <w:widowControl/>
         <w:spacing w:before="0" w:after="80" w:line="276" w:lineRule="auto"/>
+        <w:ind w:left="0" w:firstLine="0"/>
         <w:jc w:val="both"/>
-        <w:widowControl w:val="1"/>
       </w:pPr>
       <w:r>
         <w:rPr>
@@ -1425,8 +701,17 @@
           <w:i w:val="0"/>
           <w:sz w:val="24"/>
         </w:rPr>
-        <w:t xml:space="preserve">3.5. Điều kiện hoàn trả/khấu trừ cọc: </w:t>
+        <w:t>3.5. Điều kiện hoàn trả/khấu trừ cọc: {{deposit.description}}.</w:t>
       </w:r>
+    </w:p>
+    <w:p>
+      <w:pPr>
+        <w:keepNext w:val="0"/>
+        <w:widowControl/>
+        <w:spacing w:before="0" w:after="80" w:line="276" w:lineRule="auto"/>
+        <w:ind w:left="0" w:firstLine="0"/>
+        <w:jc w:val="both"/>
+      </w:pPr>
       <w:r>
         <w:rPr>
           <w:rFonts w:ascii="Times New Roman" w:hAnsi="Times New Roman" w:eastAsia="Times New Roman"/>
@@ -1434,8 +719,17 @@
           <w:i w:val="0"/>
           <w:sz w:val="24"/>
         </w:rPr>
-        <w:t>{{deposit.description}}</w:t>
+        <w:t>3.6. Khoản ban đầu gồm tiền thuê kỳ đầu và cọc; không thu lại tiền thuê kỳ đầu trong hóa đơn quyết toán kỳ đầu. Mỗi hóa đơn cuối kỳ gồm dịch vụ/điện/nước/phát sinh của kỳ vừa qua và tiền thuê kỳ sau nếu còn kỳ thuê; kỳ cuối không thu tiền thuê ngoài thời hạn. Hạn cụ thể theo {{rent.paymentDueDay}} và hóa đơn, không mặc định ngày 05 hằng tháng. Bên A có thể chốt chỉ số và phát hành hóa đơn ngay khi dữ liệu kỳ đã đầy đủ; Bên B được xem và thanh toán ngay sau khi hóa đơn được phát hành.</w:t>
       </w:r>
+    </w:p>
+    <w:p>
+      <w:pPr>
+        <w:keepNext/>
+        <w:widowControl/>
+        <w:spacing w:before="0" w:after="80" w:line="276" w:lineRule="auto"/>
+        <w:ind w:left="0" w:firstLine="0"/>
+        <w:jc w:val="both"/>
+      </w:pPr>
       <w:r>
         <w:rPr>
           <w:rFonts w:ascii="Times New Roman" w:hAnsi="Times New Roman" w:eastAsia="Times New Roman"/>
@@ -1443,33 +737,16 @@
           <w:i w:val="0"/>
           <w:sz w:val="24"/>
         </w:rPr>
-        <w:t>.</w:t>
-      </w:r>
-    </w:p>
-    <w:p>
-      <w:pPr>
-        <w:keepNext/>
-        <w:spacing w:before="0" w:after="80" w:line="276" w:lineRule="auto"/>
-        <w:jc w:val="both"/>
-        <w:widowControl w:val="1"/>
-      </w:pPr>
-      <w:r>
-        <w:rPr>
-          <w:rFonts w:ascii="Times New Roman" w:hAnsi="Times New Roman" w:eastAsia="Times New Roman"/>
-          <w:b/>
-          <w:i w:val="0"/>
-          <w:sz w:val="24"/>
-        </w:rPr>
-        <w:t>3.6. Quy định chi tiết về chuyển khoản trực tiếp và vai trò HomeSpace:</w:t>
+        <w:t>3.7. Quy định chi tiết về chuyển khoản trực tiếp và vai trò HomeSpace:</w:t>
       </w:r>
     </w:p>
     <w:p>
       <w:pPr>
         <w:keepNext w:val="0"/>
-        <w:spacing w:before="0" w:after="80" w:line="276" w:lineRule="auto"/>
-        <w:ind w:left="255" w:hanging="142"/>
+        <w:widowControl/>
+        <w:spacing w:before="0" w:after="60" w:line="276" w:lineRule="auto"/>
+        <w:ind w:left="227" w:hanging="170"/>
         <w:jc w:val="both"/>
-        <w:widowControl w:val="1"/>
       </w:pPr>
       <w:r>
         <w:rPr>
@@ -1484,10 +761,10 @@
     <w:p>
       <w:pPr>
         <w:keepNext w:val="0"/>
-        <w:spacing w:before="0" w:after="80" w:line="276" w:lineRule="auto"/>
-        <w:ind w:left="255" w:hanging="142"/>
+        <w:widowControl/>
+        <w:spacing w:before="0" w:after="60" w:line="276" w:lineRule="auto"/>
+        <w:ind w:left="227" w:hanging="170"/>
         <w:jc w:val="both"/>
-        <w:widowControl w:val="1"/>
       </w:pPr>
       <w:r>
         <w:rPr>
@@ -1502,10 +779,10 @@
     <w:p>
       <w:pPr>
         <w:keepNext w:val="0"/>
-        <w:spacing w:before="0" w:after="80" w:line="276" w:lineRule="auto"/>
-        <w:ind w:left="255" w:hanging="142"/>
+        <w:widowControl/>
+        <w:spacing w:before="0" w:after="60" w:line="276" w:lineRule="auto"/>
+        <w:ind w:left="227" w:hanging="170"/>
         <w:jc w:val="both"/>
-        <w:widowControl w:val="1"/>
       </w:pPr>
       <w:r>
         <w:rPr>
@@ -1520,10 +797,10 @@
     <w:p>
       <w:pPr>
         <w:keepNext w:val="0"/>
-        <w:spacing w:before="0" w:after="80" w:line="276" w:lineRule="auto"/>
-        <w:ind w:left="255" w:hanging="142"/>
+        <w:widowControl/>
+        <w:spacing w:before="0" w:after="60" w:line="276" w:lineRule="auto"/>
+        <w:ind w:left="227" w:hanging="170"/>
         <w:jc w:val="both"/>
-        <w:widowControl w:val="1"/>
       </w:pPr>
       <w:r>
         <w:rPr>
@@ -1538,10 +815,10 @@
     <w:p>
       <w:pPr>
         <w:keepNext w:val="0"/>
-        <w:spacing w:before="0" w:after="80" w:line="276" w:lineRule="auto"/>
-        <w:ind w:left="255" w:hanging="142"/>
+        <w:widowControl/>
+        <w:spacing w:before="0" w:after="60" w:line="276" w:lineRule="auto"/>
+        <w:ind w:left="227" w:hanging="170"/>
         <w:jc w:val="both"/>
-        <w:widowControl w:val="1"/>
       </w:pPr>
       <w:r>
         <w:rPr>
@@ -1556,10 +833,10 @@
     <w:p>
       <w:pPr>
         <w:keepNext w:val="0"/>
-        <w:spacing w:before="0" w:after="80" w:line="276" w:lineRule="auto"/>
-        <w:ind w:left="255" w:hanging="142"/>
+        <w:widowControl/>
+        <w:spacing w:before="0" w:after="60" w:line="276" w:lineRule="auto"/>
+        <w:ind w:left="227" w:hanging="170"/>
         <w:jc w:val="both"/>
-        <w:widowControl w:val="1"/>
       </w:pPr>
       <w:r>
         <w:rPr>
@@ -1574,10 +851,10 @@
     <w:p>
       <w:pPr>
         <w:keepNext w:val="0"/>
-        <w:spacing w:before="0" w:after="80" w:line="276" w:lineRule="auto"/>
-        <w:ind w:left="255" w:hanging="142"/>
+        <w:widowControl/>
+        <w:spacing w:before="0" w:after="60" w:line="276" w:lineRule="auto"/>
+        <w:ind w:left="227" w:hanging="170"/>
         <w:jc w:val="both"/>
-        <w:widowControl w:val="1"/>
       </w:pPr>
       <w:r>
         <w:rPr>
@@ -1592,31 +869,33 @@
     <w:p>
       <w:pPr>
         <w:keepNext/>
-        <w:spacing w:before="0" w:after="40" w:line="276" w:lineRule="auto"/>
+        <w:widowControl/>
+        <w:spacing w:before="0" w:after="80" w:line="276" w:lineRule="auto"/>
+        <w:ind w:left="0" w:firstLine="0"/>
         <w:jc w:val="both"/>
-        <w:widowControl w:val="1"/>
       </w:pPr>
       <w:r>
         <w:rPr>
           <w:rFonts w:ascii="Times New Roman" w:hAnsi="Times New Roman" w:eastAsia="Times New Roman"/>
-          <w:b/>
+          <w:b w:val="0"/>
           <w:i w:val="0"/>
           <w:sz w:val="24"/>
         </w:rPr>
-        <w:t>3.7. Bảng ghi nhận thanh toán ban đầu đã được hai bên xác nhận:</w:t>
+        <w:t>3.8. Bảng ghi nhận thanh toán ban đầu đã được hai bên xác nhận:</w:t>
       </w:r>
     </w:p>
     <w:p>
       <w:pPr>
         <w:keepNext w:val="0"/>
-        <w:spacing w:before="0" w:after="80" w:line="276" w:lineRule="auto"/>
-        <w:jc w:val="center"/>
-        <w:widowControl w:val="1"/>
+        <w:widowControl/>
+        <w:spacing w:before="20" w:after="100" w:line="276" w:lineRule="auto"/>
+        <w:ind w:left="0" w:firstLine="0"/>
+        <w:jc w:val="left"/>
       </w:pPr>
       <w:r>
         <w:rPr>
           <w:rFonts w:ascii="Times New Roman" w:hAnsi="Times New Roman" w:eastAsia="Times New Roman"/>
-          <w:b/>
+          <w:b w:val="0"/>
           <w:i w:val="0"/>
           <w:sz w:val="24"/>
         </w:rPr>
@@ -1626,9 +905,10 @@
     <w:p>
       <w:pPr>
         <w:keepNext w:val="0"/>
+        <w:widowControl/>
         <w:spacing w:before="0" w:after="80" w:line="276" w:lineRule="auto"/>
+        <w:ind w:left="0" w:firstLine="0"/>
         <w:jc w:val="both"/>
-        <w:widowControl w:val="1"/>
       </w:pPr>
       <w:r>
         <w:rPr>
@@ -1637,177 +917,16 @@
           <w:i w:val="0"/>
           <w:sz w:val="24"/>
         </w:rPr>
-        <w:t xml:space="preserve">3.8. Mã nội dung chuyển khoản: </w:t>
-      </w:r>
-      <w:r>
-        <w:rPr>
-          <w:rFonts w:ascii="Times New Roman" w:hAnsi="Times New Roman" w:eastAsia="Times New Roman"/>
-          <w:b w:val="0"/>
-          <w:i w:val="0"/>
-          <w:sz w:val="24"/>
-        </w:rPr>
-        <w:t>{{payment.initial.transferReference}}</w:t>
-      </w:r>
-      <w:r>
-        <w:rPr>
-          <w:rFonts w:ascii="Times New Roman" w:hAnsi="Times New Roman" w:eastAsia="Times New Roman"/>
-          <w:b w:val="0"/>
-          <w:i w:val="0"/>
-          <w:sz w:val="24"/>
-        </w:rPr>
-        <w:t xml:space="preserve">; Mã tham chiếu giao dịch ngân hàng: </w:t>
-      </w:r>
-      <w:r>
-        <w:rPr>
-          <w:rFonts w:ascii="Times New Roman" w:hAnsi="Times New Roman" w:eastAsia="Times New Roman"/>
-          <w:b w:val="0"/>
-          <w:i w:val="0"/>
-          <w:sz w:val="24"/>
-        </w:rPr>
-        <w:t>{{payment.initial.bankTransactionReference}}</w:t>
-      </w:r>
-      <w:r>
-        <w:rPr>
-          <w:rFonts w:ascii="Times New Roman" w:hAnsi="Times New Roman" w:eastAsia="Times New Roman"/>
-          <w:b w:val="0"/>
-          <w:i w:val="0"/>
-          <w:sz w:val="24"/>
-        </w:rPr>
-        <w:t xml:space="preserve">; Bên B khai báo chuyển: </w:t>
-      </w:r>
-      <w:r>
-        <w:rPr>
-          <w:rFonts w:ascii="Times New Roman" w:hAnsi="Times New Roman" w:eastAsia="Times New Roman"/>
-          <w:b w:val="0"/>
-          <w:i w:val="0"/>
-          <w:sz w:val="24"/>
-        </w:rPr>
-        <w:t>{{payment.initial.payerReportedAt}}</w:t>
-      </w:r>
-      <w:r>
-        <w:rPr>
-          <w:rFonts w:ascii="Times New Roman" w:hAnsi="Times New Roman" w:eastAsia="Times New Roman"/>
-          <w:b w:val="0"/>
-          <w:i w:val="0"/>
-          <w:sz w:val="24"/>
-        </w:rPr>
-        <w:t xml:space="preserve">; Bên A xác nhận nhận: </w:t>
-      </w:r>
-      <w:r>
-        <w:rPr>
-          <w:rFonts w:ascii="Times New Roman" w:hAnsi="Times New Roman" w:eastAsia="Times New Roman"/>
-          <w:b w:val="0"/>
-          <w:i w:val="0"/>
-          <w:sz w:val="24"/>
-        </w:rPr>
-        <w:t>{{payment.initial.payeeConfirmedAt}}</w:t>
-      </w:r>
-      <w:r>
-        <w:rPr>
-          <w:rFonts w:ascii="Times New Roman" w:hAnsi="Times New Roman" w:eastAsia="Times New Roman"/>
-          <w:b w:val="0"/>
-          <w:i w:val="0"/>
-          <w:sz w:val="24"/>
-        </w:rPr>
-        <w:t xml:space="preserve">; Hoàn tất xác nhận hai chiều: </w:t>
-      </w:r>
-      <w:r>
-        <w:rPr>
-          <w:rFonts w:ascii="Times New Roman" w:hAnsi="Times New Roman" w:eastAsia="Times New Roman"/>
-          <w:b w:val="0"/>
-          <w:i w:val="0"/>
-          <w:sz w:val="24"/>
-        </w:rPr>
-        <w:t>{{payment.initial.confirmedAt}}</w:t>
-      </w:r>
-      <w:r>
-        <w:rPr>
-          <w:rFonts w:ascii="Times New Roman" w:hAnsi="Times New Roman" w:eastAsia="Times New Roman"/>
-          <w:b w:val="0"/>
-          <w:i w:val="0"/>
-          <w:sz w:val="24"/>
-        </w:rPr>
-        <w:t xml:space="preserve">; Trạng thái xác nhận: </w:t>
-      </w:r>
-      <w:r>
-        <w:rPr>
-          <w:rFonts w:ascii="Times New Roman" w:hAnsi="Times New Roman" w:eastAsia="Times New Roman"/>
-          <w:b w:val="0"/>
-          <w:i w:val="0"/>
-          <w:sz w:val="24"/>
-        </w:rPr>
-        <w:t>{{payment.initial.status}}</w:t>
-      </w:r>
-      <w:r>
-        <w:rPr>
-          <w:rFonts w:ascii="Times New Roman" w:hAnsi="Times New Roman" w:eastAsia="Times New Roman"/>
-          <w:b w:val="0"/>
-          <w:i w:val="0"/>
-          <w:sz w:val="24"/>
-        </w:rPr>
-        <w:t xml:space="preserve">; Tổng số tiền ban đầu: </w:t>
-      </w:r>
-      <w:r>
-        <w:rPr>
-          <w:rFonts w:ascii="Times New Roman" w:hAnsi="Times New Roman" w:eastAsia="Times New Roman"/>
-          <w:b w:val="0"/>
-          <w:i w:val="0"/>
-          <w:sz w:val="24"/>
-        </w:rPr>
-        <w:t>{{payment.initial.totalAmount}}</w:t>
-      </w:r>
-      <w:r>
-        <w:rPr>
-          <w:rFonts w:ascii="Times New Roman" w:hAnsi="Times New Roman" w:eastAsia="Times New Roman"/>
-          <w:b w:val="0"/>
-          <w:i w:val="0"/>
-          <w:sz w:val="24"/>
-        </w:rPr>
-        <w:t xml:space="preserve">; Thời điểm hoàn tất (tương thích V2): </w:t>
-      </w:r>
-      <w:r>
-        <w:rPr>
-          <w:rFonts w:ascii="Times New Roman" w:hAnsi="Times New Roman" w:eastAsia="Times New Roman"/>
-          <w:b w:val="0"/>
-          <w:i w:val="0"/>
-          <w:sz w:val="24"/>
-        </w:rPr>
-        <w:t>{{payment.initial.paidAt}}</w:t>
-      </w:r>
-      <w:r>
-        <w:rPr>
-          <w:rFonts w:ascii="Times New Roman" w:hAnsi="Times New Roman" w:eastAsia="Times New Roman"/>
-          <w:b w:val="0"/>
-          <w:i w:val="0"/>
-          <w:sz w:val="24"/>
-        </w:rPr>
-        <w:t xml:space="preserve">; Mã giao dịch đối chiếu (tương thích V2): </w:t>
-      </w:r>
-      <w:r>
-        <w:rPr>
-          <w:rFonts w:ascii="Times New Roman" w:hAnsi="Times New Roman" w:eastAsia="Times New Roman"/>
-          <w:b w:val="0"/>
-          <w:i w:val="0"/>
-          <w:sz w:val="24"/>
-        </w:rPr>
-        <w:t>{{payment.initial.transactionCode}}</w:t>
-      </w:r>
-      <w:r>
-        <w:rPr>
-          <w:rFonts w:ascii="Times New Roman" w:hAnsi="Times New Roman" w:eastAsia="Times New Roman"/>
-          <w:b w:val="0"/>
-          <w:i w:val="0"/>
-          <w:sz w:val="24"/>
-        </w:rPr>
-        <w:t>.</w:t>
+        <w:t>3.9. Mã nội dung chuyển khoản: {{payment.initial.transferReference}}; Mã tham chiếu giao dịch ngân hàng: {{payment.initial.bankTransactionReference}}; Bên B khai báo chuyển: {{payment.initial.payerReportedAt}}; Bên A xác nhận nhận: {{payment.initial.payeeConfirmedAt}}; Hoàn tất xác nhận hai chiều: {{payment.initial.confirmedAt}}; Trạng thái xác nhận: {{payment.initial.status}}; Tổng số tiền ban đầu: {{payment.initial.totalAmount}}; Thời điểm hoàn tất (tương thích V2): {{payment.initial.paidAt}}; Mã giao dịch đối chiếu (tương thích V2): {{payment.initial.transactionCode}}.</w:t>
       </w:r>
     </w:p>
     <w:p>
       <w:pPr>
         <w:keepNext/>
+        <w:widowControl/>
         <w:spacing w:before="160" w:after="80" w:line="276" w:lineRule="auto"/>
-        <w:jc w:val="both"/>
-        <w:widowControl w:val="1"/>
+        <w:ind w:left="0" w:firstLine="0"/>
+        <w:jc w:val="left"/>
       </w:pPr>
       <w:r>
         <w:rPr>
@@ -1822,14 +941,15 @@
     <w:p>
       <w:pPr>
         <w:keepNext/>
-        <w:spacing w:before="0" w:after="40" w:line="276" w:lineRule="auto"/>
+        <w:widowControl/>
+        <w:spacing w:before="0" w:after="80" w:line="276" w:lineRule="auto"/>
+        <w:ind w:left="0" w:firstLine="0"/>
         <w:jc w:val="both"/>
-        <w:widowControl w:val="1"/>
       </w:pPr>
       <w:r>
         <w:rPr>
           <w:rFonts w:ascii="Times New Roman" w:hAnsi="Times New Roman" w:eastAsia="Times New Roman"/>
-          <w:b/>
+          <w:b w:val="0"/>
           <w:i w:val="0"/>
           <w:sz w:val="24"/>
         </w:rPr>
@@ -1839,14 +959,15 @@
     <w:p>
       <w:pPr>
         <w:keepNext w:val="0"/>
-        <w:spacing w:before="0" w:after="80" w:line="276" w:lineRule="auto"/>
-        <w:jc w:val="center"/>
-        <w:widowControl w:val="1"/>
+        <w:widowControl/>
+        <w:spacing w:before="20" w:after="100" w:line="276" w:lineRule="auto"/>
+        <w:ind w:left="0" w:firstLine="0"/>
+        <w:jc w:val="left"/>
       </w:pPr>
       <w:r>
         <w:rPr>
           <w:rFonts w:ascii="Times New Roman" w:hAnsi="Times New Roman" w:eastAsia="Times New Roman"/>
-          <w:b/>
+          <w:b w:val="0"/>
           <w:i w:val="0"/>
           <w:sz w:val="24"/>
         </w:rPr>
@@ -1856,14 +977,15 @@
     <w:p>
       <w:pPr>
         <w:keepNext/>
-        <w:spacing w:before="0" w:after="40" w:line="276" w:lineRule="auto"/>
+        <w:widowControl/>
+        <w:spacing w:before="0" w:after="80" w:line="276" w:lineRule="auto"/>
+        <w:ind w:left="0" w:firstLine="0"/>
         <w:jc w:val="both"/>
-        <w:widowControl w:val="1"/>
       </w:pPr>
       <w:r>
         <w:rPr>
           <w:rFonts w:ascii="Times New Roman" w:hAnsi="Times New Roman" w:eastAsia="Times New Roman"/>
-          <w:b/>
+          <w:b w:val="0"/>
           <w:i w:val="0"/>
           <w:sz w:val="24"/>
         </w:rPr>
@@ -1873,14 +995,15 @@
     <w:p>
       <w:pPr>
         <w:keepNext w:val="0"/>
-        <w:spacing w:before="0" w:after="80" w:line="276" w:lineRule="auto"/>
-        <w:jc w:val="center"/>
-        <w:widowControl w:val="1"/>
+        <w:widowControl/>
+        <w:spacing w:before="20" w:after="100" w:line="276" w:lineRule="auto"/>
+        <w:ind w:left="0" w:firstLine="0"/>
+        <w:jc w:val="left"/>
       </w:pPr>
       <w:r>
         <w:rPr>
           <w:rFonts w:ascii="Times New Roman" w:hAnsi="Times New Roman" w:eastAsia="Times New Roman"/>
-          <w:b/>
+          <w:b w:val="0"/>
           <w:i w:val="0"/>
           <w:sz w:val="24"/>
         </w:rPr>
@@ -1890,9 +1013,10 @@
     <w:p>
       <w:pPr>
         <w:keepNext w:val="0"/>
+        <w:widowControl/>
         <w:spacing w:before="0" w:after="80" w:line="276" w:lineRule="auto"/>
+        <w:ind w:left="0" w:firstLine="0"/>
         <w:jc w:val="both"/>
-        <w:widowControl w:val="1"/>
       </w:pPr>
       <w:r>
         <w:rPr>
@@ -1907,9 +1031,10 @@
     <w:p>
       <w:pPr>
         <w:keepNext/>
+        <w:widowControl/>
         <w:spacing w:before="160" w:after="80" w:line="276" w:lineRule="auto"/>
-        <w:jc w:val="both"/>
-        <w:widowControl w:val="1"/>
+        <w:ind w:left="0" w:firstLine="0"/>
+        <w:jc w:val="left"/>
       </w:pPr>
       <w:r>
         <w:rPr>
@@ -1924,14 +1049,15 @@
     <w:p>
       <w:pPr>
         <w:keepNext/>
-        <w:spacing w:before="0" w:after="40" w:line="276" w:lineRule="auto"/>
+        <w:widowControl/>
+        <w:spacing w:before="0" w:after="80" w:line="276" w:lineRule="auto"/>
+        <w:ind w:left="0" w:firstLine="0"/>
         <w:jc w:val="both"/>
-        <w:widowControl w:val="1"/>
       </w:pPr>
       <w:r>
         <w:rPr>
           <w:rFonts w:ascii="Times New Roman" w:hAnsi="Times New Roman" w:eastAsia="Times New Roman"/>
-          <w:b/>
+          <w:b w:val="0"/>
           <w:i w:val="0"/>
           <w:sz w:val="24"/>
         </w:rPr>
@@ -1941,14 +1067,15 @@
     <w:p>
       <w:pPr>
         <w:keepNext w:val="0"/>
-        <w:spacing w:before="0" w:after="80" w:line="276" w:lineRule="auto"/>
-        <w:jc w:val="center"/>
-        <w:widowControl w:val="1"/>
+        <w:widowControl/>
+        <w:spacing w:before="20" w:after="100" w:line="276" w:lineRule="auto"/>
+        <w:ind w:left="0" w:firstLine="0"/>
+        <w:jc w:val="left"/>
       </w:pPr>
       <w:r>
         <w:rPr>
           <w:rFonts w:ascii="Times New Roman" w:hAnsi="Times New Roman" w:eastAsia="Times New Roman"/>
-          <w:b/>
+          <w:b w:val="0"/>
           <w:i w:val="0"/>
           <w:sz w:val="24"/>
         </w:rPr>
@@ -1958,9 +1085,10 @@
     <w:p>
       <w:pPr>
         <w:keepNext w:val="0"/>
+        <w:widowControl/>
         <w:spacing w:before="0" w:after="80" w:line="276" w:lineRule="auto"/>
+        <w:ind w:left="0" w:firstLine="0"/>
         <w:jc w:val="both"/>
-        <w:widowControl w:val="1"/>
       </w:pPr>
       <w:r>
         <w:rPr>
@@ -1975,9 +1103,10 @@
     <w:p>
       <w:pPr>
         <w:keepNext/>
+        <w:widowControl/>
         <w:spacing w:before="160" w:after="80" w:line="276" w:lineRule="auto"/>
-        <w:jc w:val="both"/>
-        <w:widowControl w:val="1"/>
+        <w:ind w:left="0" w:firstLine="0"/>
+        <w:jc w:val="left"/>
       </w:pPr>
       <w:r>
         <w:rPr>
@@ -1992,9 +1121,10 @@
     <w:p>
       <w:pPr>
         <w:keepNext w:val="0"/>
+        <w:widowControl/>
         <w:spacing w:before="0" w:after="80" w:line="276" w:lineRule="auto"/>
+        <w:ind w:left="0" w:firstLine="0"/>
         <w:jc w:val="both"/>
-        <w:widowControl w:val="1"/>
       </w:pPr>
       <w:r>
         <w:rPr>
@@ -2009,9 +1139,10 @@
     <w:p>
       <w:pPr>
         <w:keepNext w:val="0"/>
+        <w:widowControl/>
         <w:spacing w:before="0" w:after="80" w:line="276" w:lineRule="auto"/>
+        <w:ind w:left="0" w:firstLine="0"/>
         <w:jc w:val="both"/>
-        <w:widowControl w:val="1"/>
       </w:pPr>
       <w:r>
         <w:rPr>
@@ -2026,9 +1157,10 @@
     <w:p>
       <w:pPr>
         <w:keepNext w:val="0"/>
+        <w:widowControl/>
         <w:spacing w:before="0" w:after="80" w:line="276" w:lineRule="auto"/>
+        <w:ind w:left="0" w:firstLine="0"/>
         <w:jc w:val="both"/>
-        <w:widowControl w:val="1"/>
       </w:pPr>
       <w:r>
         <w:rPr>
@@ -2043,9 +1175,10 @@
     <w:p>
       <w:pPr>
         <w:keepNext/>
+        <w:widowControl/>
         <w:spacing w:before="160" w:after="80" w:line="276" w:lineRule="auto"/>
-        <w:jc w:val="both"/>
-        <w:widowControl w:val="1"/>
+        <w:ind w:left="0" w:firstLine="0"/>
+        <w:jc w:val="left"/>
       </w:pPr>
       <w:r>
         <w:rPr>
@@ -2060,9 +1193,10 @@
     <w:p>
       <w:pPr>
         <w:keepNext w:val="0"/>
+        <w:widowControl/>
         <w:spacing w:before="0" w:after="80" w:line="276" w:lineRule="auto"/>
+        <w:ind w:left="0" w:firstLine="0"/>
         <w:jc w:val="both"/>
-        <w:widowControl w:val="1"/>
       </w:pPr>
       <w:r>
         <w:rPr>
@@ -2071,69 +1205,16 @@
           <w:i w:val="0"/>
           <w:sz w:val="24"/>
         </w:rPr>
-        <w:t>7.1. Sử dụng đúng số lượng người cư trú (</w:t>
-      </w:r>
-      <w:r>
-        <w:rPr>
-          <w:rFonts w:ascii="Times New Roman" w:hAnsi="Times New Roman" w:eastAsia="Times New Roman"/>
-          <w:b w:val="0"/>
-          <w:i w:val="0"/>
-          <w:sz w:val="24"/>
-        </w:rPr>
-        <w:t>{{tenant.occupantCount}}</w:t>
-      </w:r>
-      <w:r>
-        <w:rPr>
-          <w:rFonts w:ascii="Times New Roman" w:hAnsi="Times New Roman" w:eastAsia="Times New Roman"/>
-          <w:b w:val="0"/>
-          <w:i w:val="0"/>
-          <w:sz w:val="24"/>
-        </w:rPr>
-        <w:t xml:space="preserve"> người), đúng số lượng phương tiện đăng ký (</w:t>
-      </w:r>
-      <w:r>
-        <w:rPr>
-          <w:rFonts w:ascii="Times New Roman" w:hAnsi="Times New Roman" w:eastAsia="Times New Roman"/>
-          <w:b w:val="0"/>
-          <w:i w:val="0"/>
-          <w:sz w:val="24"/>
-        </w:rPr>
-        <w:t>{{tenant.motorbikeCount}}</w:t>
-      </w:r>
-      <w:r>
-        <w:rPr>
-          <w:rFonts w:ascii="Times New Roman" w:hAnsi="Times New Roman" w:eastAsia="Times New Roman"/>
-          <w:b w:val="0"/>
-          <w:i w:val="0"/>
-          <w:sz w:val="24"/>
-        </w:rPr>
-        <w:t xml:space="preserve"> xe máy, </w:t>
-      </w:r>
-      <w:r>
-        <w:rPr>
-          <w:rFonts w:ascii="Times New Roman" w:hAnsi="Times New Roman" w:eastAsia="Times New Roman"/>
-          <w:b w:val="0"/>
-          <w:i w:val="0"/>
-          <w:sz w:val="24"/>
-        </w:rPr>
-        <w:t>{{tenant.carCount}}</w:t>
-      </w:r>
-      <w:r>
-        <w:rPr>
-          <w:rFonts w:ascii="Times New Roman" w:hAnsi="Times New Roman" w:eastAsia="Times New Roman"/>
-          <w:b w:val="0"/>
-          <w:i w:val="0"/>
-          <w:sz w:val="24"/>
-        </w:rPr>
-        <w:t xml:space="preserve"> ô tô).</w:t>
+        <w:t>7.1. Sử dụng đúng số lượng người cư trú ({{tenant.occupantCount}} người), đúng số lượng phương tiện đăng ký ({{tenant.motorbikeCount}} xe máy, {{tenant.carCount}} ô tô).</w:t>
       </w:r>
     </w:p>
     <w:p>
       <w:pPr>
         <w:keepNext w:val="0"/>
+        <w:widowControl/>
         <w:spacing w:before="0" w:after="80" w:line="276" w:lineRule="auto"/>
+        <w:ind w:left="0" w:firstLine="0"/>
         <w:jc w:val="both"/>
-        <w:widowControl w:val="1"/>
       </w:pPr>
       <w:r>
         <w:rPr>
@@ -2148,9 +1229,10 @@
     <w:p>
       <w:pPr>
         <w:keepNext w:val="0"/>
+        <w:widowControl/>
         <w:spacing w:before="0" w:after="80" w:line="276" w:lineRule="auto"/>
+        <w:ind w:left="0" w:firstLine="0"/>
         <w:jc w:val="both"/>
-        <w:widowControl w:val="1"/>
       </w:pPr>
       <w:r>
         <w:rPr>
@@ -2165,9 +1247,10 @@
     <w:p>
       <w:pPr>
         <w:keepNext/>
+        <w:widowControl/>
         <w:spacing w:before="160" w:after="80" w:line="276" w:lineRule="auto"/>
-        <w:jc w:val="both"/>
-        <w:widowControl w:val="1"/>
+        <w:ind w:left="0" w:firstLine="0"/>
+        <w:jc w:val="left"/>
       </w:pPr>
       <w:r>
         <w:rPr>
@@ -2182,9 +1265,10 @@
     <w:p>
       <w:pPr>
         <w:keepNext w:val="0"/>
+        <w:widowControl/>
         <w:spacing w:before="0" w:after="80" w:line="276" w:lineRule="auto"/>
+        <w:ind w:left="0" w:firstLine="0"/>
         <w:jc w:val="both"/>
-        <w:widowControl w:val="1"/>
       </w:pPr>
       <w:r>
         <w:rPr>
@@ -2198,45 +1282,11 @@
     </w:p>
     <w:p>
       <w:pPr>
-        <w:keepNext w:val="0"/>
-        <w:spacing w:before="0" w:after="80" w:line="276" w:lineRule="auto"/>
-        <w:jc w:val="both"/>
-        <w:widowControl w:val="1"/>
-      </w:pPr>
-      <w:r>
-        <w:rPr>
-          <w:rFonts w:ascii="Times New Roman" w:hAnsi="Times New Roman" w:eastAsia="Times New Roman"/>
-          <w:b w:val="0"/>
-          <w:i w:val="0"/>
-          <w:sz w:val="24"/>
-        </w:rPr>
-        <w:t xml:space="preserve">8.2. Điều khoản đặc biệt khác: </w:t>
-      </w:r>
-      <w:r>
-        <w:rPr>
-          <w:rFonts w:ascii="Times New Roman" w:hAnsi="Times New Roman" w:eastAsia="Times New Roman"/>
-          <w:b w:val="0"/>
-          <w:i w:val="0"/>
-          <w:sz w:val="24"/>
-        </w:rPr>
-        <w:t>{{contract.specialTerms}}</w:t>
-      </w:r>
-      <w:r>
-        <w:rPr>
-          <w:rFonts w:ascii="Times New Roman" w:hAnsi="Times New Roman" w:eastAsia="Times New Roman"/>
-          <w:b w:val="0"/>
-          <w:i w:val="0"/>
-          <w:sz w:val="24"/>
-        </w:rPr>
-        <w:t>.</w:t>
-      </w:r>
-    </w:p>
-    <w:p>
-      <w:pPr>
         <w:keepNext/>
+        <w:widowControl/>
         <w:spacing w:before="160" w:after="80" w:line="276" w:lineRule="auto"/>
-        <w:jc w:val="both"/>
-        <w:widowControl w:val="1"/>
+        <w:ind w:left="0" w:firstLine="0"/>
+        <w:jc w:val="left"/>
       </w:pPr>
       <w:r>
         <w:rPr>
@@ -2251,9 +1301,10 @@
     <w:p>
       <w:pPr>
         <w:keepNext w:val="0"/>
+        <w:widowControl/>
         <w:spacing w:before="0" w:after="80" w:line="276" w:lineRule="auto"/>
+        <w:ind w:left="0" w:firstLine="0"/>
         <w:jc w:val="both"/>
-        <w:widowControl w:val="1"/>
       </w:pPr>
       <w:r>
         <w:rPr>
@@ -2262,15 +1313,16 @@
           <w:i w:val="0"/>
           <w:sz w:val="24"/>
         </w:rPr>
-        <w:t>9.1. Quy định thông báo trước khi chấm dứt hợp đồng; hoàn trả nhà và quyết toán hoàn cọc chuyển khoản trực tiếp.</w:t>
+        <w:t>9.1. Bên muốn chấm dứt hợp đồng thực hiện thông báo trước theo thỏa thuận; Bên B hoàn trả nhà, chìa khóa và tài sản bàn giao; số cọc còn phải hoàn được quyết toán và chuyển khoản trực tiếp theo Hợp đồng.</w:t>
       </w:r>
     </w:p>
     <w:p>
       <w:pPr>
         <w:keepNext w:val="0"/>
+        <w:widowControl/>
         <w:spacing w:before="0" w:after="80" w:line="276" w:lineRule="auto"/>
+        <w:ind w:left="0" w:firstLine="0"/>
         <w:jc w:val="both"/>
-        <w:widowControl w:val="1"/>
       </w:pPr>
       <w:r>
         <w:rPr>
@@ -2279,15 +1331,52 @@
           <w:i w:val="0"/>
           <w:sz w:val="24"/>
         </w:rPr>
-        <w:t>9.2. Trường hợp bất khả kháng; giải quyết tranh chấp thông qua thương lượng hoặc Tòa án có thẩm quyền.</w:t>
+        <w:t>9.2. Nếu hóa đơn quá hạn, phí chậm thanh toán (nếu có) chỉ tính theo mức và cách tính đã ghi trong điều khoản được điền; không ghi số cố định khác và được ghi riêng trên hóa đơn quá hạn. Khi Bên B khai báo đã chuyển khoản, việc cập nhật phí của khoản đó tạm dừng để đối soát. Từ 00:00 ngày quá hạn thứ 5 theo giờ Việt Nam, chủ nhà có thể cho chuyển công nợ và phí phạt đã chốt sang kỳ tiếp theo nếu còn kỳ; phí của khoản chuyển dừng tăng và khoản cũ chỉ được cộng một lần, hoặc đề nghị hai bên chấm dứt sớm. Nếu Bên B đồng ý chấm dứt sớm, Bên A xác nhận đã thực tế nhận lại nhà, chìa khóa và tài sản rồi mới hoàn tất. Nếu Bên B từ chối, hợp đồng vẫn hiệu lực; Bên A có thể rút đề nghị hoặc xử lý theo đúng điều khoản đã ký sau khi thông báo và thực tế nhận lại nhà, chìa khóa, tài sản. Chỉ sau khi hoàn tất bàn giao mới mở lại tin đăng hoặc cập nhật trạng thái hợp đồng/cọc. Công nợ chưa thanh toán vẫn được theo dõi riêng; HomeSpace không tự thu tiền, giữ tiền hoặc cưỡng chế thu hồi nhà.</w:t>
+      </w:r>
+    </w:p>
+    <w:p>
+      <w:pPr>
+        <w:keepNext w:val="0"/>
+        <w:widowControl/>
+        <w:spacing w:before="0" w:after="80" w:line="276" w:lineRule="auto"/>
+        <w:ind w:left="0" w:firstLine="0"/>
+        <w:jc w:val="both"/>
+      </w:pPr>
+      <w:r>
+        <w:rPr>
+          <w:rFonts w:ascii="Times New Roman" w:hAnsi="Times New Roman" w:eastAsia="Times New Roman"/>
+          <w:b w:val="0"/>
+          <w:i w:val="0"/>
+          <w:sz w:val="24"/>
+        </w:rPr>
+        <w:t>9.3. Toàn văn điều khoản quá hạn, phí chậm trả và phương án chấm dứt đã được backend chốt: {{contract.specialTerms}}</w:t>
+      </w:r>
+    </w:p>
+    <w:p>
+      <w:pPr>
+        <w:keepNext w:val="0"/>
+        <w:widowControl/>
+        <w:spacing w:before="0" w:after="80" w:line="276" w:lineRule="auto"/>
+        <w:ind w:left="0" w:firstLine="0"/>
+        <w:jc w:val="both"/>
+      </w:pPr>
+      <w:r>
+        <w:rPr>
+          <w:rFonts w:ascii="Times New Roman" w:hAnsi="Times New Roman" w:eastAsia="Times New Roman"/>
+          <w:b w:val="0"/>
+          <w:i w:val="0"/>
+          <w:sz w:val="24"/>
+        </w:rPr>
+        <w:t>9.4. Trường hợp bất khả kháng; tranh chấp được ưu tiên giải quyết thông qua thương lượng, trường hợp không đạt thỏa thuận thì giải quyết tại Tòa án có thẩm quyền.</w:t>
       </w:r>
     </w:p>
     <w:p>
       <w:pPr>
         <w:keepNext/>
+        <w:widowControl/>
         <w:spacing w:before="160" w:after="80" w:line="276" w:lineRule="auto"/>
-        <w:jc w:val="both"/>
-        <w:widowControl w:val="1"/>
+        <w:ind w:left="0" w:firstLine="0"/>
+        <w:jc w:val="left"/>
       </w:pPr>
       <w:r>
         <w:rPr>
@@ -2302,9 +1391,10 @@
     <w:p>
       <w:pPr>
         <w:keepNext w:val="0"/>
+        <w:widowControl/>
         <w:spacing w:before="0" w:after="80" w:line="276" w:lineRule="auto"/>
+        <w:ind w:left="0" w:firstLine="0"/>
         <w:jc w:val="both"/>
-        <w:widowControl w:val="1"/>
       </w:pPr>
       <w:r>
         <w:rPr>
@@ -2319,9 +1409,10 @@
     <w:p>
       <w:pPr>
         <w:keepNext w:val="0"/>
+        <w:widowControl/>
         <w:spacing w:before="0" w:after="80" w:line="276" w:lineRule="auto"/>
+        <w:ind w:left="0" w:firstLine="0"/>
         <w:jc w:val="both"/>
-        <w:widowControl w:val="1"/>
       </w:pPr>
       <w:r>
         <w:rPr>
@@ -2330,51 +1421,16 @@
           <w:i w:val="0"/>
           <w:sz w:val="24"/>
         </w:rPr>
-        <w:t xml:space="preserve">10.2. Phiên bản schema: </w:t>
-      </w:r>
-      <w:r>
-        <w:rPr>
-          <w:rFonts w:ascii="Times New Roman" w:hAnsi="Times New Roman" w:eastAsia="Times New Roman"/>
-          <w:b w:val="0"/>
-          <w:i w:val="0"/>
-          <w:sz w:val="24"/>
-        </w:rPr>
-        <w:t>{{contract.schemaVersion}}</w:t>
-      </w:r>
-      <w:r>
-        <w:rPr>
-          <w:rFonts w:ascii="Times New Roman" w:hAnsi="Times New Roman" w:eastAsia="Times New Roman"/>
-          <w:b w:val="0"/>
-          <w:i w:val="0"/>
-          <w:sz w:val="24"/>
-        </w:rPr>
-        <w:t xml:space="preserve">, Số hiệu bản sửa đổi: </w:t>
-      </w:r>
-      <w:r>
-        <w:rPr>
-          <w:rFonts w:ascii="Times New Roman" w:hAnsi="Times New Roman" w:eastAsia="Times New Roman"/>
-          <w:b w:val="0"/>
-          <w:i w:val="0"/>
-          <w:sz w:val="24"/>
-        </w:rPr>
-        <w:t>{{contract.revisionNumber}}</w:t>
-      </w:r>
-      <w:r>
-        <w:rPr>
-          <w:rFonts w:ascii="Times New Roman" w:hAnsi="Times New Roman" w:eastAsia="Times New Roman"/>
-          <w:b w:val="0"/>
-          <w:i w:val="0"/>
-          <w:sz w:val="24"/>
-        </w:rPr>
-        <w:t>.</w:t>
+        <w:t>10.2. Phiên bản schema: {{contract.schemaVersion}}, Số hiệu bản sửa đổi: {{contract.revisionNumber}}.</w:t>
       </w:r>
     </w:p>
     <w:p>
       <w:pPr>
         <w:keepNext w:val="0"/>
-        <w:spacing w:before="0" w:after="0" w:line="276" w:lineRule="auto"/>
+        <w:widowControl/>
+        <w:spacing w:before="0" w:after="80" w:line="276" w:lineRule="auto"/>
+        <w:ind w:left="0" w:firstLine="0"/>
         <w:jc w:val="both"/>
-        <w:widowControl w:val="1"/>
       </w:pPr>
       <w:r>
         <w:rPr>
@@ -2388,7 +1444,6 @@
     </w:p>
     <w:sectPr>
       <w:headerReference w:type="default" r:id="rId9"/>
-      <w:footerReference w:type="default" r:id="rId10"/>
       <w:pgSz w:w="11906" w:h="16838"/>
       <w:pgMar w:top="1701" w:right="1417" w:bottom="1417" w:left="1417" w:header="709" w:footer="709" w:gutter="0"/>
       <w:cols w:space="720"/>
@@ -2398,17 +1453,6 @@
 </w:document>
 </file>
 
-<file path=word/footer1.xml><?xml version="1.0" encoding="utf-8"?>
-<w:ftr xmlns:m="http://schemas.openxmlformats.org/officeDocument/2006/math" xmlns:mc="http://schemas.openxmlformats.org/markup-compatibility/2006" xmlns:mo="http://schemas.microsoft.com/office/mac/office/2008/main" xmlns:mv="urn:schemas-microsoft-com:mac:vml" xmlns:o="urn:schemas-microsoft-com:office:office" xmlns:r="http://schemas.openxmlformats.org/officeDocument/2006/relationships" xmlns:v="urn:schemas-microsoft-com:vml" xmlns:w10="urn:schemas-microsoft-com:office:word" xmlns:w14="http://schemas.microsoft.com/office/word/2010/wordml" xmlns:w="http://schemas.openxmlformats.org/wordprocessingml/2006/main" xmlns:wne="http://schemas.microsoft.com/office/word/2006/wordml" xmlns:wp14="http://schemas.microsoft.com/office/word/2010/wordprocessingDrawing" xmlns:wp="http://schemas.openxmlformats.org/drawingml/2006/wordprocessingDrawing" xmlns:wpc="http://schemas.microsoft.com/office/word/2010/wordprocessingCanvas" xmlns:wpg="http://schemas.microsoft.com/office/word/2010/wordprocessingGroup" xmlns:wpi="http://schemas.microsoft.com/office/word/2010/wordprocessingInk" xmlns:wps="http://schemas.microsoft.com/office/word/2010/wordprocessingShape" mc:Ignorable="w14 wp14">
-  <w:p>
-    <w:pPr>
-      <w:pStyle w:val="Footer"/>
-    </w:pPr>
-    <w:r/>
-  </w:p>
-</w:ftr>
-</file>
-
 <file path=word/header1.xml><?xml version="1.0" encoding="utf-8"?>
 <w:hdr xmlns:m="http://schemas.openxmlformats.org/officeDocument/2006/math" xmlns:mc="http://schemas.openxmlformats.org/markup-compatibility/2006" xmlns:mo="http://schemas.microsoft.com/office/mac/office/2008/main" xmlns:mv="urn:schemas-microsoft-com:mac:vml" xmlns:o="urn:schemas-microsoft-com:office:office" xmlns:r="http://schemas.openxmlformats.org/officeDocument/2006/relationships" xmlns:v="urn:schemas-microsoft-com:vml" xmlns:w10="urn:schemas-microsoft-com:office:word" xmlns:w14="http://schemas.microsoft.com/office/word/2010/wordml" xmlns:w="http://schemas.openxmlformats.org/wordprocessingml/2006/main" xmlns:wne="http://schemas.microsoft.com/office/word/2006/wordml" xmlns:wp14="http://schemas.microsoft.com/office/word/2010/wordprocessingDrawing" xmlns:wp="http://schemas.openxmlformats.org/drawingml/2006/wordprocessingDrawing" xmlns:wpc="http://schemas.microsoft.com/office/word/2010/wordprocessingCanvas" xmlns:wpg="http://schemas.microsoft.com/office/word/2010/wordprocessingGroup" xmlns:wpi="http://schemas.microsoft.com/office/word/2010/wordprocessingInk" xmlns:wps="http://schemas.microsoft.com/office/word/2010/wordprocessingShape" mc:Ignorable="w14 wp14">
   <w:p>
@@ -2417,13 +1461,14 @@
       <w:spacing w:after="0"/>
       <w:jc w:val="right"/>
     </w:pPr>
+    <w:r/>
     <w:r>
       <w:rPr>
         <w:rFonts w:ascii="Times New Roman" w:hAnsi="Times New Roman" w:eastAsia="Times New Roman"/>
         <w:b w:val="0"/>
         <w:i w:val="0"/>
-        <w:color w:val="969696"/>
-        <w:sz w:val="16"/>
+        <w:color w:val="A0A0A0"/>
+        <w:sz w:val="17"/>
       </w:rPr>
       <w:t>HomeSpace | Mẫu hợp đồng điện tử | Nhà nguyên căn</w:t>
     </w:r>
@@ -2794,9 +1839,6 @@
     <w:name w:val="Normal"/>
     <w:qFormat/>
     <w:rsid w:val="00FC693F"/>
-    <w:pPr>
-      <w:spacing w:line="276" w:lineRule="auto" w:after="80"/>
-    </w:pPr>
     <w:rPr>
       <w:rFonts w:ascii="Times New Roman" w:hAnsi="Times New Roman" w:eastAsia="Times New Roman"/>
       <w:sz w:val="24"/>

</xml_diff>